<commit_message>
docs(uat): switch v2 guide to Staging URL + dev login flow
Production SSO-only blocks multi-role testing (1 SSO = 1 role).
UAT requires testing all 5 roles, so switch target to Staging
(Vercel Preview) where dev login cards remain available.

Changes:
- Section 3.1: Production URL → Staging URL placeholder
- Section 3.3: SSO flow → dev login card click flow
- Section 4.1: SSO mapping note → dev login description
- Cover: change summary updated (Staging vs Production split)
- New callout: explains why Staging (multi-role) vs Production (SSO-only)

Co-Authored-By: Claude Opus 4.7 (1M context) <noreply@anthropic.com>
</commit_message>
<xml_diff>
--- a/docs/uat/UAT_가이드_v2.docx
+++ b/docs/uat/UAT_가이드_v2.docx
@@ -555,24 +555,7 @@
           <w:sz w:val="22"/>
           <w:szCs w:val="22"/>
         </w:rPr>
-        <w:t xml:space="preserve">Production 배포 검증 완료 — Staging URL 대신 Production URL 사용</w:t>
-      </w:r>
-    </w:p>
-    <w:p>
-      <w:pPr>
-        <w:pStyle w:val="ListParagraph"/>
-        <w:numPr>
-          <w:ilvl w:val="0"/>
-          <w:numId w:val="2"/>
-        </w:numPr>
-      </w:pPr>
-      <w:r>
-        <w:rPr>
-          <w:rFonts w:ascii="Malgun Gothic" w:cs="Malgun Gothic" w:eastAsia="Malgun Gothic" w:hAnsi="Malgun Gothic"/>
-          <w:sz w:val="22"/>
-          <w:szCs w:val="22"/>
-        </w:rPr>
-        <w:t xml:space="preserve">SSO-only 로그인 — 개발용 dev login 카드 prod에서 제거됨</w:t>
+        <w:t xml:space="preserve">테스트 환경: Staging (Vercel Preview) — dev login 카드로 9개 역할 전환 가능 (Production은 SSO-only로 분리)</w:t>
       </w:r>
     </w:p>
     <w:p>
@@ -1657,7 +1640,7 @@
                 <w:sz w:val="22"/>
                 <w:szCs w:val="22"/>
               </w:rPr>
-              <w:t xml:space="preserve">Production URL</w:t>
+              <w:t xml:space="preserve">Staging URL</w:t>
             </w:r>
           </w:p>
         </w:tc>
@@ -1687,7 +1670,7 @@
                 <w:sz w:val="22"/>
                 <w:szCs w:val="22"/>
               </w:rPr>
-              <w:t xml:space="preserve">https://hr.ctr.co.kr (배포 후 확정)</w:t>
+              <w:t xml:space="preserve">[UAT 관리자가 킥오프 시 안내 — Vercel Preview deployment]</w:t>
             </w:r>
           </w:p>
         </w:tc>
@@ -1749,7 +1732,7 @@
                 <w:sz w:val="22"/>
                 <w:szCs w:val="22"/>
               </w:rPr>
-              <w:t xml:space="preserve">Microsoft 365 SSO (Azure AD) — 회사 계정 사용</w:t>
+              <w:t xml:space="preserve">테스트 계정 카드 (이메일만으로 로그인) — SSO 인증 불필요</w:t>
             </w:r>
           </w:p>
         </w:tc>
@@ -1879,6 +1862,32 @@
         </w:tc>
       </w:tr>
     </w:tbl>
+    <w:p>
+      <w:pPr>
+        <w:shd w:fill="E8F4F8" w:color="auto" w:val="clear"/>
+        <w:spacing w:after="120" w:before="120"/>
+        <w:ind w:left="240" w:right="240"/>
+      </w:pPr>
+      <w:r>
+        <w:rPr>
+          <w:rFonts w:ascii="Malgun Gothic" w:cs="Malgun Gothic" w:eastAsia="Malgun Gothic" w:hAnsi="Malgun Gothic"/>
+          <w:b/>
+          <w:bCs/>
+          <w:color w:val="1B7BA8"/>
+          <w:sz w:val="22"/>
+          <w:szCs w:val="22"/>
+        </w:rPr>
+        <w:t xml:space="preserve">왜 Staging인가? </w:t>
+      </w:r>
+      <w:r>
+        <w:rPr>
+          <w:rFonts w:ascii="Malgun Gothic" w:cs="Malgun Gothic" w:eastAsia="Malgun Gothic" w:hAnsi="Malgun Gothic"/>
+          <w:sz w:val="22"/>
+          <w:szCs w:val="22"/>
+        </w:rPr>
+        <w:t xml:space="preserve">UAT는 5개 역할(EMPLOYEE/MANAGER/EXECUTIVE/HR_ADMIN/SUPER_ADMIN)을 모두 검증해야 합니다. Production은 회사 SSO 1:1 매핑이라 한 사람당 한 역할만 보이므로 multi-role 테스트가 불가능합니다. Staging은 dev login 카드로 9개 테스트 계정을 자유롭게 전환할 수 있어 UAT에 적합합니다.</w:t>
+      </w:r>
+    </w:p>
     <w:p>
       <w:pPr>
         <w:pStyle w:val="Heading2"/>
@@ -1909,7 +1918,7 @@
           <w:sz w:val="22"/>
           <w:szCs w:val="22"/>
         </w:rPr>
-        <w:t xml:space="preserve">Production 환경은 실데이터 기반입니다. 테스트 시 데이터 변경에 유의해 주세요.</w:t>
+        <w:t xml:space="preserve">Staging 환경은 UAT 전용 시드 데이터로 구성됩니다 (엣지케이스 30명, 이력 3년치 사전 적재).</w:t>
       </w:r>
     </w:p>
     <w:p>
@@ -1926,7 +1935,7 @@
           <w:sz w:val="22"/>
           <w:szCs w:val="22"/>
         </w:rPr>
-        <w:t xml:space="preserve">UAT 전용 시드 데이터(엣지케이스 30명, 이력 3년치)가 사전 적재되어 있습니다.</w:t>
+        <w:t xml:space="preserve">테스트 시작 전 seed 데이터로 초기화됩니다.</w:t>
       </w:r>
     </w:p>
     <w:p>
@@ -1943,7 +1952,24 @@
           <w:sz w:val="22"/>
           <w:szCs w:val="22"/>
         </w:rPr>
-        <w:t xml:space="preserve">데이터 리셋이 필요한 경우 UAT 관리자에게 요청해 주세요.</w:t>
+        <w:t xml:space="preserve">테스트 기간 중 데이터 리셋이 필요한 경우 UAT 관리자에게 요청해 주세요.</w:t>
+      </w:r>
+    </w:p>
+    <w:p>
+      <w:pPr>
+        <w:pStyle w:val="ListParagraph"/>
+        <w:numPr>
+          <w:ilvl w:val="0"/>
+          <w:numId w:val="2"/>
+        </w:numPr>
+      </w:pPr>
+      <w:r>
+        <w:rPr>
+          <w:rFonts w:ascii="Malgun Gothic" w:cs="Malgun Gothic" w:eastAsia="Malgun Gothic" w:hAnsi="Malgun Gothic"/>
+          <w:sz w:val="22"/>
+          <w:szCs w:val="22"/>
+        </w:rPr>
+        <w:t xml:space="preserve">리셋 시 모든 테스트 데이터가 초기 상태로 돌아갑니다.</w:t>
       </w:r>
     </w:p>
     <w:p>
@@ -1976,7 +2002,7 @@
           <w:sz w:val="22"/>
           <w:szCs w:val="22"/>
         </w:rPr>
-        <w:t xml:space="preserve">Production URL에 Chrome 브라우저로 접속합니다.</w:t>
+        <w:t xml:space="preserve">Staging URL에 Chrome 브라우저로 접속합니다.</w:t>
       </w:r>
     </w:p>
     <w:p>
@@ -1993,7 +2019,7 @@
           <w:sz w:val="22"/>
           <w:szCs w:val="22"/>
         </w:rPr>
-        <w:t xml:space="preserve">"Login with Microsoft 365" 버튼을 클릭합니다.</w:t>
+        <w:t xml:space="preserve">로그인 화면에서 테스트 계정 카드 목록을 확인합니다 (9개 역할).</w:t>
       </w:r>
     </w:p>
     <w:p>
@@ -2010,7 +2036,7 @@
           <w:sz w:val="22"/>
           <w:szCs w:val="22"/>
         </w:rPr>
-        <w:t xml:space="preserve">회사 Microsoft 365 계정으로 인증합니다.</w:t>
+        <w:t xml:space="preserve">테스트할 역할에 맞는 카드를 클릭하면 자동 로그인됩니다.</w:t>
       </w:r>
     </w:p>
     <w:p>
@@ -2032,6 +2058,23 @@
     </w:p>
     <w:p>
       <w:pPr>
+        <w:pStyle w:val="ListParagraph"/>
+        <w:numPr>
+          <w:ilvl w:val="0"/>
+          <w:numId w:val="3"/>
+        </w:numPr>
+      </w:pPr>
+      <w:r>
+        <w:rPr>
+          <w:rFonts w:ascii="Malgun Gothic" w:cs="Malgun Gothic" w:eastAsia="Malgun Gothic" w:hAnsi="Malgun Gothic"/>
+          <w:sz w:val="22"/>
+          <w:szCs w:val="22"/>
+        </w:rPr>
+        <w:t xml:space="preserve">다른 역할로 전환하려면 우측 상단 프로필 → 로그아웃 후 다른 카드를 선택합니다.</w:t>
+      </w:r>
+    </w:p>
+    <w:p>
+      <w:pPr>
         <w:shd w:fill="FFF4E5" w:color="auto" w:val="clear"/>
         <w:spacing w:after="120" w:before="120"/>
         <w:ind w:left="240" w:right="240"/>
@@ -2045,7 +2088,7 @@
           <w:sz w:val="22"/>
           <w:szCs w:val="22"/>
         </w:rPr>
-        <w:t xml:space="preserve">※ v1.0과의 차이: </w:t>
+        <w:t xml:space="preserve">⚠ Production과의 차이: </w:t>
       </w:r>
       <w:r>
         <w:rPr>
@@ -2053,7 +2096,7 @@
           <w:sz w:val="22"/>
           <w:szCs w:val="22"/>
         </w:rPr>
-        <w:t xml:space="preserve">Production 환경에서는 dev login 테스트 계정 카드가 표시되지 않습니다. SSO 로그인만 사용 가능합니다.</w:t>
+        <w:t xml:space="preserve">Production(hr.ctr.co.kr)은 Microsoft 365 SSO 전용으로 운영되며, dev login 카드가 표시되지 않습니다. UAT는 Staging URL로 진행해야 9개 테스트 계정 사용이 가능합니다.</w:t>
       </w:r>
     </w:p>
     <w:p>
@@ -2098,7 +2141,7 @@
           <w:sz w:val="22"/>
           <w:szCs w:val="22"/>
         </w:rPr>
-        <w:t xml:space="preserve">UAT 기간 중 사용 가능한 SSO 매핑 계정입니다. 각 계정은 회사 Microsoft 365 인증과 연결되어 있습니다.</w:t>
+        <w:t xml:space="preserve">Staging 환경에서 dev login 카드로 즉시 전환 가능한 시드 계정입니다. 이메일만 입력하면 로그인되며, 비밀번호나 SSO 인증은 불필요합니다.</w:t>
       </w:r>
     </w:p>
     <w:tbl>
@@ -6678,7 +6721,7 @@
           <w:sz w:val="22"/>
           <w:szCs w:val="22"/>
         </w:rPr>
-        <w:t xml:space="preserve">Production 배포 commit a5b0dade 시점, 1440×900 viewport, ko-KR locale, Light mode.</w:t>
+        <w:t xml:space="preserve">commit a5b0dade(2026-05-10) 시점, 1440×900 viewport, ko-KR locale, Light mode. Staging과 Production은 동일 코드 베이스이므로 화면 레이아웃은 일치합니다.</w:t>
       </w:r>
     </w:p>
     <w:p>

</xml_diff>

<commit_message>
docs(uat): bake staging URL + add reproducible builder script
- Move builder from /tmp to scripts/uat/ (was lost between sessions)
- Fill staging URL placeholder with actual Vercel preview alias
- Add isolated package.json (docx dep stays out of main app)
- Update .gitignore for scripts/uat/node_modules
- README documents how to regenerate the docx

Co-Authored-By: Claude Opus 4.7 (1M context) <noreply@anthropic.com>
</commit_message>
<xml_diff>
--- a/docs/uat/UAT_가이드_v2.docx
+++ b/docs/uat/UAT_가이드_v2.docx
@@ -1670,7 +1670,7 @@
                 <w:sz w:val="22"/>
                 <w:szCs w:val="22"/>
               </w:rPr>
-              <w:t xml:space="preserve">[UAT 관리자가 킥오프 시 안내 — Vercel Preview deployment]</w:t>
+              <w:t xml:space="preserve">https://ctr-hr-hub-git-staging-sangwoos-projects-b01c065c.vercel.app</w:t>
             </w:r>
           </w:p>
         </w:tc>
@@ -12669,7 +12669,7 @@
           <w:sz w:val="22"/>
           <w:szCs w:val="22"/>
         </w:rPr>
-        <w:t xml:space="preserve">※ "해결됨" 정의: 수정 완료 → production 배포 → 보고자 재테스트 → 종료</w:t>
+        <w:t xml:space="preserve">※ "해결됨" 정의: 수정 완료 → staging 배포 → 보고자 재테스트 → 종료</w:t>
       </w:r>
     </w:p>
     <w:p>

</xml_diff>

<commit_message>
chore(qa): rename SUPER_ADMIN test account 최상우 → 대조영
CEO's real name collided with the SUPER_ADMIN QA seed account.
Renamed across all surfaces — seed, login dev card, e2e helper,
CLAUDE.md table, UAT v2 docx (builder + regenerated output).
nameEn 'Sangwoo Choi' → 'Daejoyoung' for consistency.

Screenshots in docs/uat/screenshots-v2/ still show old name in
the SUPER_ADMIN home/inbox/notifications captures — re-capture
is a follow-up (cosmetic, not blocking UAT).

Co-Authored-By: Claude Opus 4.7 (1M context) <noreply@anthropic.com>
</commit_message>
<xml_diff>
--- a/docs/uat/UAT_가이드_v2.docx
+++ b/docs/uat/UAT_가이드_v2.docx
@@ -2488,7 +2488,7 @@
                 <w:sz w:val="22"/>
                 <w:szCs w:val="22"/>
               </w:rPr>
-              <w:t xml:space="preserve">최상우</w:t>
+              <w:t xml:space="preserve">대조영</w:t>
             </w:r>
           </w:p>
         </w:tc>
@@ -7042,7 +7042,7 @@
           <w:sz w:val="22"/>
           <w:szCs w:val="22"/>
         </w:rPr>
-        <w:t xml:space="preserve">5.1.4 SUPER_ADMIN — 최상우 (super@ctr.co.kr)</w:t>
+        <w:t xml:space="preserve">5.1.4 SUPER_ADMIN — 대조영 (super@ctr.co.kr)</w:t>
       </w:r>
     </w:p>
     <w:p>

</xml_diff>

<commit_message>
chore(qa): rename SUPER_ADMIN test account 최상우 → 대조영 (#26)
CEO's real name collided with the SUPER_ADMIN QA seed account.
Renamed across all surfaces — seed, login dev card, e2e helper,
CLAUDE.md table, UAT v2 docx (builder + regenerated output).
nameEn 'Sangwoo Choi' → 'Daejoyoung' for consistency.

Screenshots in docs/uat/screenshots-v2/ still show old name in
the SUPER_ADMIN home/inbox/notifications captures — re-capture
is a follow-up (cosmetic, not blocking UAT).

Co-authored-by: Claude Opus 4.7 (1M context) <noreply@anthropic.com>
</commit_message>
<xml_diff>
--- a/docs/uat/UAT_가이드_v2.docx
+++ b/docs/uat/UAT_가이드_v2.docx
@@ -2488,7 +2488,7 @@
                 <w:sz w:val="22"/>
                 <w:szCs w:val="22"/>
               </w:rPr>
-              <w:t xml:space="preserve">최상우</w:t>
+              <w:t xml:space="preserve">대조영</w:t>
             </w:r>
           </w:p>
         </w:tc>
@@ -7042,7 +7042,7 @@
           <w:sz w:val="22"/>
           <w:szCs w:val="22"/>
         </w:rPr>
-        <w:t xml:space="preserve">5.1.4 SUPER_ADMIN — 최상우 (super@ctr.co.kr)</w:t>
+        <w:t xml:space="preserve">5.1.4 SUPER_ADMIN — 대조영 (super@ctr.co.kr)</w:t>
       </w:r>
     </w:p>
     <w:p>

</xml_diff>

<commit_message>
docs(uat): rewrite guide in HR-friendly language
CEO feedback after first review:
1. Remove v1→v2 change summary on cover — first delivery, no diff needed
2. UAT 관리자 '상우님' → '강상우' (full name with surname)
3. Replace developer jargon with plain Korean for HR audience:
   - Staging / Production → 테스트 사이트 / 실제 운영 사이트
   - dev login 카드 → 테스트 계정 카드
   - SSO → 회사 계정 로그인 / Microsoft 365 회사 계정
   - EMPLOYEE/MANAGER/EXECUTIVE/HR_ADMIN/SUPER_ADMIN
     → 직원/팀장/임원/인사담당자/전사관리자
   - 엣지케이스 페르소나 → 특수 상황 테스트 직원
   - 스모크 테스트 → 기본 동작 확인
   - 킥오프 / 워크스루 → 시작 미팅 / 안내
   - 트리아지 → 분류
   - 사인오프 → 최종 승인
   - GO / NO-GO → 승인 / 반려
   - Critical/Major/Minor → 치명적/중대/경미
   - Phase 9 batch / Cluster D / E2E fail → "내부 자동 점검 항목 중 일부"
   - commit hash / viewport / locale / Light mode → 캡처 기준 단순 설명
   - R4 promote / Vercel Preview / Redis 캐시 / UTC → 모두 제거 또는 평이한 표현

Header/footer/title에서 'v2.0' 제거. 첫 공식 배포로 표현 정리.

Co-Authored-By: Claude Opus 4.7 (1M context) <noreply@anthropic.com>
</commit_message>
<xml_diff>
--- a/docs/uat/UAT_가이드_v2.docx
+++ b/docs/uat/UAT_가이드_v2.docx
@@ -46,7 +46,7 @@
           <w:sz w:val="28"/>
           <w:szCs w:val="28"/>
         </w:rPr>
-        <w:t xml:space="preserve">Version 2.0</w:t>
+        <w:t xml:space="preserve">핵심 업무 모듈 검증 가이드</w:t>
       </w:r>
     </w:p>
     <w:tbl>
@@ -163,7 +163,7 @@
                 <w:sz w:val="22"/>
                 <w:szCs w:val="22"/>
               </w:rPr>
-              <w:t xml:space="preserve">문서 버전</w:t>
+              <w:t xml:space="preserve">작성일</w:t>
             </w:r>
           </w:p>
         </w:tc>
@@ -193,7 +193,7 @@
                 <w:sz w:val="22"/>
                 <w:szCs w:val="22"/>
               </w:rPr>
-              <w:t xml:space="preserve">v2.0</w:t>
+              <w:t xml:space="preserve">2026년 5월 11일</w:t>
             </w:r>
           </w:p>
         </w:tc>
@@ -225,7 +225,7 @@
                 <w:sz w:val="22"/>
                 <w:szCs w:val="22"/>
               </w:rPr>
-              <w:t xml:space="preserve">작성일</w:t>
+              <w:t xml:space="preserve">작성자</w:t>
             </w:r>
           </w:p>
         </w:tc>
@@ -255,7 +255,7 @@
                 <w:sz w:val="22"/>
                 <w:szCs w:val="22"/>
               </w:rPr>
-              <w:t xml:space="preserve">2026년 5월 10일</w:t>
+              <w:t xml:space="preserve">CTR 개발팀</w:t>
             </w:r>
           </w:p>
         </w:tc>
@@ -287,7 +287,7 @@
                 <w:sz w:val="22"/>
                 <w:szCs w:val="22"/>
               </w:rPr>
-              <w:t xml:space="preserve">이전 버전</w:t>
+              <w:t xml:space="preserve">대상</w:t>
             </w:r>
           </w:p>
         </w:tc>
@@ -317,7 +317,7 @@
                 <w:sz w:val="22"/>
                 <w:szCs w:val="22"/>
               </w:rPr>
-              <w:t xml:space="preserve">v1.0 (2026-04-17)</w:t>
+              <w:t xml:space="preserve">인사 담당자 (UAT 테스터)</w:t>
             </w:r>
           </w:p>
         </w:tc>
@@ -349,130 +349,6 @@
                 <w:sz w:val="22"/>
                 <w:szCs w:val="22"/>
               </w:rPr>
-              <w:t xml:space="preserve">작성자</w:t>
-            </w:r>
-          </w:p>
-        </w:tc>
-        <w:tc>
-          <w:tcPr>
-            <w:tcW w:type="dxa" w:w="6360"/>
-            <w:tcBorders>
-              <w:top w:val="single" w:color="BFBFBF" w:sz="4"/>
-              <w:left w:val="single" w:color="BFBFBF" w:sz="4"/>
-              <w:bottom w:val="single" w:color="BFBFBF" w:sz="4"/>
-              <w:right w:val="single" w:color="BFBFBF" w:sz="4"/>
-            </w:tcBorders>
-            <w:tcMar>
-              <w:top w:type="dxa" w:w="100"/>
-              <w:left w:type="dxa" w:w="140"/>
-              <w:bottom w:type="dxa" w:w="100"/>
-              <w:right w:type="dxa" w:w="140"/>
-            </w:tcMar>
-          </w:tcPr>
-          <w:p>
-            <w:pPr>
-              <w:jc w:val="left"/>
-            </w:pPr>
-            <w:r>
-              <w:rPr>
-                <w:rFonts w:ascii="Malgun Gothic" w:cs="Malgun Gothic" w:eastAsia="Malgun Gothic" w:hAnsi="Malgun Gothic"/>
-                <w:sz w:val="22"/>
-                <w:szCs w:val="22"/>
-              </w:rPr>
-              <w:t xml:space="preserve">CTR 개발팀</w:t>
-            </w:r>
-          </w:p>
-        </w:tc>
-      </w:tr>
-      <w:tr>
-        <w:tc>
-          <w:tcPr>
-            <w:tcW w:type="dxa" w:w="3000"/>
-            <w:tcBorders>
-              <w:top w:val="single" w:color="BFBFBF" w:sz="4"/>
-              <w:left w:val="single" w:color="BFBFBF" w:sz="4"/>
-              <w:bottom w:val="single" w:color="BFBFBF" w:sz="4"/>
-              <w:right w:val="single" w:color="BFBFBF" w:sz="4"/>
-            </w:tcBorders>
-            <w:tcMar>
-              <w:top w:type="dxa" w:w="100"/>
-              <w:left w:type="dxa" w:w="140"/>
-              <w:bottom w:type="dxa" w:w="100"/>
-              <w:right w:type="dxa" w:w="140"/>
-            </w:tcMar>
-          </w:tcPr>
-          <w:p>
-            <w:pPr>
-              <w:jc w:val="left"/>
-            </w:pPr>
-            <w:r>
-              <w:rPr>
-                <w:rFonts w:ascii="Malgun Gothic" w:cs="Malgun Gothic" w:eastAsia="Malgun Gothic" w:hAnsi="Malgun Gothic"/>
-                <w:sz w:val="22"/>
-                <w:szCs w:val="22"/>
-              </w:rPr>
-              <w:t xml:space="preserve">대상</w:t>
-            </w:r>
-          </w:p>
-        </w:tc>
-        <w:tc>
-          <w:tcPr>
-            <w:tcW w:type="dxa" w:w="6360"/>
-            <w:tcBorders>
-              <w:top w:val="single" w:color="BFBFBF" w:sz="4"/>
-              <w:left w:val="single" w:color="BFBFBF" w:sz="4"/>
-              <w:bottom w:val="single" w:color="BFBFBF" w:sz="4"/>
-              <w:right w:val="single" w:color="BFBFBF" w:sz="4"/>
-            </w:tcBorders>
-            <w:tcMar>
-              <w:top w:type="dxa" w:w="100"/>
-              <w:left w:type="dxa" w:w="140"/>
-              <w:bottom w:type="dxa" w:w="100"/>
-              <w:right w:type="dxa" w:w="140"/>
-            </w:tcMar>
-          </w:tcPr>
-          <w:p>
-            <w:pPr>
-              <w:jc w:val="left"/>
-            </w:pPr>
-            <w:r>
-              <w:rPr>
-                <w:rFonts w:ascii="Malgun Gothic" w:cs="Malgun Gothic" w:eastAsia="Malgun Gothic" w:hAnsi="Malgun Gothic"/>
-                <w:sz w:val="22"/>
-                <w:szCs w:val="22"/>
-              </w:rPr>
-              <w:t xml:space="preserve">UAT 테스터 (HR 담당자)</w:t>
-            </w:r>
-          </w:p>
-        </w:tc>
-      </w:tr>
-      <w:tr>
-        <w:tc>
-          <w:tcPr>
-            <w:tcW w:type="dxa" w:w="3000"/>
-            <w:tcBorders>
-              <w:top w:val="single" w:color="BFBFBF" w:sz="4"/>
-              <w:left w:val="single" w:color="BFBFBF" w:sz="4"/>
-              <w:bottom w:val="single" w:color="BFBFBF" w:sz="4"/>
-              <w:right w:val="single" w:color="BFBFBF" w:sz="4"/>
-            </w:tcBorders>
-            <w:tcMar>
-              <w:top w:type="dxa" w:w="100"/>
-              <w:left w:type="dxa" w:w="140"/>
-              <w:bottom w:type="dxa" w:w="100"/>
-              <w:right w:type="dxa" w:w="140"/>
-            </w:tcMar>
-          </w:tcPr>
-          <w:p>
-            <w:pPr>
-              <w:jc w:val="left"/>
-            </w:pPr>
-            <w:r>
-              <w:rPr>
-                <w:rFonts w:ascii="Malgun Gothic" w:cs="Malgun Gothic" w:eastAsia="Malgun Gothic" w:hAnsi="Malgun Gothic"/>
-                <w:sz w:val="22"/>
-                <w:szCs w:val="22"/>
-              </w:rPr>
               <w:t xml:space="preserve">분류</w:t>
             </w:r>
           </w:p>
@@ -509,72 +385,6 @@
         </w:tc>
       </w:tr>
     </w:tbl>
-    <w:p>
-      <w:pPr>
-        <w:spacing w:after="120" w:before="360"/>
-      </w:pPr>
-      <w:r>
-        <w:rPr>
-          <w:rFonts w:ascii="Malgun Gothic" w:cs="Malgun Gothic" w:eastAsia="Malgun Gothic" w:hAnsi="Malgun Gothic"/>
-          <w:b/>
-          <w:bCs/>
-          <w:sz w:val="24"/>
-          <w:szCs w:val="24"/>
-        </w:rPr>
-        <w:t xml:space="preserve">v1.0 → v2.0 변경 요약</w:t>
-      </w:r>
-    </w:p>
-    <w:p>
-      <w:pPr>
-        <w:pStyle w:val="ListParagraph"/>
-        <w:numPr>
-          <w:ilvl w:val="0"/>
-          <w:numId w:val="2"/>
-        </w:numPr>
-      </w:pPr>
-      <w:r>
-        <w:rPr>
-          <w:rFonts w:ascii="Malgun Gothic" w:cs="Malgun Gothic" w:eastAsia="Malgun Gothic" w:hAnsi="Malgun Gothic"/>
-          <w:sz w:val="22"/>
-          <w:szCs w:val="22"/>
-        </w:rPr>
-        <w:t xml:space="preserve">홈 대시보드 V2 정식 승격 (R4 promote 완료) — 4개 역할별 신규 화면 캡처 추가</w:t>
-      </w:r>
-    </w:p>
-    <w:p>
-      <w:pPr>
-        <w:pStyle w:val="ListParagraph"/>
-        <w:numPr>
-          <w:ilvl w:val="0"/>
-          <w:numId w:val="2"/>
-        </w:numPr>
-      </w:pPr>
-      <w:r>
-        <w:rPr>
-          <w:rFonts w:ascii="Malgun Gothic" w:cs="Malgun Gothic" w:eastAsia="Malgun Gothic" w:hAnsi="Malgun Gothic"/>
-          <w:sz w:val="22"/>
-          <w:szCs w:val="22"/>
-        </w:rPr>
-        <w:t xml:space="preserve">테스트 환경: Staging (Vercel Preview) — dev login 카드로 9개 역할 전환 가능 (Production은 SSO-only로 분리)</w:t>
-      </w:r>
-    </w:p>
-    <w:p>
-      <w:pPr>
-        <w:pStyle w:val="ListParagraph"/>
-        <w:numPr>
-          <w:ilvl w:val="0"/>
-          <w:numId w:val="2"/>
-        </w:numPr>
-      </w:pPr>
-      <w:r>
-        <w:rPr>
-          <w:rFonts w:ascii="Malgun Gothic" w:cs="Malgun Gothic" w:eastAsia="Malgun Gothic" w:hAnsi="Malgun Gothic"/>
-          <w:sz w:val="22"/>
-          <w:szCs w:val="22"/>
-        </w:rPr>
-        <w:t xml:space="preserve">알려진 이슈 8개 → 5개로 감소 (Phase 9 회귀 안전망 batch 1-17 반영)</w:t>
-      </w:r>
-    </w:p>
     <w:p>
       <w:r>
         <w:br w:type="page"/>
@@ -651,7 +461,7 @@
           <w:sz w:val="22"/>
           <w:szCs w:val="22"/>
         </w:rPr>
-        <w:t xml:space="preserve">Round 1 — 핵심 업무 모듈(인사관리, 출퇴근, 휴가, 급여, 결재/승인, 설정)에 대한 심층 검증을 수행하고, 나머지 모듈(채용, 성과/보상, 인사이트 등)에 대해서는 스모크 테스트로 기본 동작을 확인합니다.</w:t>
+        <w:t xml:space="preserve">1차 테스트 — 핵심 업무 모듈(인사관리, 출퇴근, 휴가, 급여, 결재/승인, 설정)을 자세히 검증하고, 나머지 모듈(채용, 성과/보상, 인사이트 등)은 기본 동작만 간단히 점검합니다.</w:t>
       </w:r>
     </w:p>
     <w:p>
@@ -877,7 +687,7 @@
                 <w:sz w:val="22"/>
                 <w:szCs w:val="22"/>
               </w:rPr>
-              <w:t xml:space="preserve">상우님</w:t>
+              <w:t xml:space="preserve">강상우</w:t>
             </w:r>
           </w:p>
         </w:tc>
@@ -907,7 +717,7 @@
                 <w:sz w:val="22"/>
                 <w:szCs w:val="22"/>
               </w:rPr>
-              <w:t xml:space="preserve">전체 조율, 이슈 트리아지, 최종 판정</w:t>
+              <w:t xml:space="preserve">전체 조율, 이슈 분류, 최종 판정</w:t>
             </w:r>
           </w:p>
         </w:tc>
@@ -1148,7 +958,7 @@
                 <w:sz w:val="22"/>
                 <w:szCs w:val="22"/>
               </w:rPr>
-              <w:t xml:space="preserve">Day 1</w:t>
+              <w:t xml:space="preserve">1일차</w:t>
             </w:r>
           </w:p>
         </w:tc>
@@ -1178,7 +988,7 @@
                 <w:sz w:val="22"/>
                 <w:szCs w:val="22"/>
               </w:rPr>
-              <w:t xml:space="preserve">킥오프, 계정 확인, 가이드 워크스루, 스모크 테스트</w:t>
+              <w:t xml:space="preserve">시작 미팅, 계정 확인, 가이드 안내, 전체 기본 동작 점검</w:t>
             </w:r>
           </w:p>
         </w:tc>
@@ -1210,7 +1020,7 @@
                 <w:sz w:val="22"/>
                 <w:szCs w:val="22"/>
               </w:rPr>
-              <w:t xml:space="preserve">Day 2-4</w:t>
+              <w:t xml:space="preserve">2-4일차</w:t>
             </w:r>
           </w:p>
         </w:tc>
@@ -1272,7 +1082,7 @@
                 <w:sz w:val="22"/>
                 <w:szCs w:val="22"/>
               </w:rPr>
-              <w:t xml:space="preserve">Day 5-6</w:t>
+              <w:t xml:space="preserve">5-6일차</w:t>
             </w:r>
           </w:p>
         </w:tc>
@@ -1334,7 +1144,7 @@
                 <w:sz w:val="22"/>
                 <w:szCs w:val="22"/>
               </w:rPr>
-              <w:t xml:space="preserve">Day 7-8</w:t>
+              <w:t xml:space="preserve">7-8일차</w:t>
             </w:r>
           </w:p>
         </w:tc>
@@ -1396,7 +1206,7 @@
                 <w:sz w:val="22"/>
                 <w:szCs w:val="22"/>
               </w:rPr>
-              <w:t xml:space="preserve">Day 9</w:t>
+              <w:t xml:space="preserve">9일차</w:t>
             </w:r>
           </w:p>
         </w:tc>
@@ -1426,7 +1236,7 @@
                 <w:sz w:val="22"/>
                 <w:szCs w:val="22"/>
               </w:rPr>
-              <w:t xml:space="preserve">체크리스트 모듈 + 엣지케이스 + 수정건 재테스트</w:t>
+              <w:t xml:space="preserve">체크리스트 모듈 + 특수 상황 사례 + 수정 사항 재테스트</w:t>
             </w:r>
           </w:p>
         </w:tc>
@@ -1458,7 +1268,7 @@
                 <w:sz w:val="22"/>
                 <w:szCs w:val="22"/>
               </w:rPr>
-              <w:t xml:space="preserve">Day 10</w:t>
+              <w:t xml:space="preserve">10일차</w:t>
             </w:r>
           </w:p>
         </w:tc>
@@ -1488,7 +1298,7 @@
                 <w:sz w:val="22"/>
                 <w:szCs w:val="22"/>
               </w:rPr>
-              <w:t xml:space="preserve">최종 재테스트 + 알려진 이슈 정리 + 사인오프 결정</w:t>
+              <w:t xml:space="preserve">최종 재테스트 + 알려진 이슈 정리 + 최종 승인 결정</w:t>
             </w:r>
           </w:p>
         </w:tc>
@@ -1640,7 +1450,7 @@
                 <w:sz w:val="22"/>
                 <w:szCs w:val="22"/>
               </w:rPr>
-              <w:t xml:space="preserve">Staging URL</w:t>
+              <w:t xml:space="preserve">테스트 사이트 주소</w:t>
             </w:r>
           </w:p>
         </w:tc>
@@ -1702,7 +1512,7 @@
                 <w:sz w:val="22"/>
                 <w:szCs w:val="22"/>
               </w:rPr>
-              <w:t xml:space="preserve">로그인 방식</w:t>
+              <w:t xml:space="preserve">로그인 방법</w:t>
             </w:r>
           </w:p>
         </w:tc>
@@ -1732,7 +1542,7 @@
                 <w:sz w:val="22"/>
                 <w:szCs w:val="22"/>
               </w:rPr>
-              <w:t xml:space="preserve">테스트 계정 카드 (이메일만으로 로그인) — SSO 인증 불필요</w:t>
+              <w:t xml:space="preserve">테스트 계정 카드 클릭 — 비밀번호 불필요</w:t>
             </w:r>
           </w:p>
         </w:tc>
@@ -1877,7 +1687,7 @@
           <w:sz w:val="22"/>
           <w:szCs w:val="22"/>
         </w:rPr>
-        <w:t xml:space="preserve">왜 Staging인가? </w:t>
+        <w:t xml:space="preserve">왜 별도 테스트 사이트인가요? </w:t>
       </w:r>
       <w:r>
         <w:rPr>
@@ -1885,7 +1695,7 @@
           <w:sz w:val="22"/>
           <w:szCs w:val="22"/>
         </w:rPr>
-        <w:t xml:space="preserve">UAT는 5개 역할(EMPLOYEE/MANAGER/EXECUTIVE/HR_ADMIN/SUPER_ADMIN)을 모두 검증해야 합니다. Production은 회사 SSO 1:1 매핑이라 한 사람당 한 역할만 보이므로 multi-role 테스트가 불가능합니다. Staging은 dev login 카드로 9개 테스트 계정을 자유롭게 전환할 수 있어 UAT에 적합합니다.</w:t>
+        <w:t xml:space="preserve">UAT는 5개 역할(직원/팀장/임원/인사담당자/전사관리자)을 모두 점검해야 합니다. 실제 운영 사이트는 본인 계정으로만 로그인할 수 있어 한 사람당 한 역할만 보이지만, 테스트 사이트에서는 9개 테스트 계정 카드를 클릭만 하면 즉시 역할을 전환할 수 있어 UAT에 적합합니다.</w:t>
       </w:r>
     </w:p>
     <w:p>
@@ -1918,7 +1728,7 @@
           <w:sz w:val="22"/>
           <w:szCs w:val="22"/>
         </w:rPr>
-        <w:t xml:space="preserve">Staging 환경은 UAT 전용 시드 데이터로 구성됩니다 (엣지케이스 30명, 이력 3년치 사전 적재).</w:t>
+        <w:t xml:space="preserve">테스트 사이트는 UAT 전용 가상 데이터로 구성됩니다 (특수 상황 직원 30명, 3년치 이력 사전 입력).</w:t>
       </w:r>
     </w:p>
     <w:p>
@@ -1935,7 +1745,7 @@
           <w:sz w:val="22"/>
           <w:szCs w:val="22"/>
         </w:rPr>
-        <w:t xml:space="preserve">테스트 시작 전 seed 데이터로 초기화됩니다.</w:t>
+        <w:t xml:space="preserve">테스트 시작 전 가상 데이터로 초기화됩니다.</w:t>
       </w:r>
     </w:p>
     <w:p>
@@ -1952,7 +1762,7 @@
           <w:sz w:val="22"/>
           <w:szCs w:val="22"/>
         </w:rPr>
-        <w:t xml:space="preserve">테스트 기간 중 데이터 리셋이 필요한 경우 UAT 관리자에게 요청해 주세요.</w:t>
+        <w:t xml:space="preserve">테스트 기간 중 데이터 초기화가 필요하면 UAT 관리자에게 요청해 주세요.</w:t>
       </w:r>
     </w:p>
     <w:p>
@@ -1969,7 +1779,7 @@
           <w:sz w:val="22"/>
           <w:szCs w:val="22"/>
         </w:rPr>
-        <w:t xml:space="preserve">리셋 시 모든 테스트 데이터가 초기 상태로 돌아갑니다.</w:t>
+        <w:t xml:space="preserve">초기화 시 모든 테스트 데이터가 시작 상태로 돌아갑니다.</w:t>
       </w:r>
     </w:p>
     <w:p>
@@ -2002,7 +1812,7 @@
           <w:sz w:val="22"/>
           <w:szCs w:val="22"/>
         </w:rPr>
-        <w:t xml:space="preserve">Staging URL에 Chrome 브라우저로 접속합니다.</w:t>
+        <w:t xml:space="preserve">테스트 사이트 주소에 Chrome 브라우저로 접속합니다.</w:t>
       </w:r>
     </w:p>
     <w:p>
@@ -2019,7 +1829,7 @@
           <w:sz w:val="22"/>
           <w:szCs w:val="22"/>
         </w:rPr>
-        <w:t xml:space="preserve">로그인 화면에서 테스트 계정 카드 목록을 확인합니다 (9개 역할).</w:t>
+        <w:t xml:space="preserve">로그인 화면에서 테스트 계정 카드 목록을 확인합니다 (총 9개).</w:t>
       </w:r>
     </w:p>
     <w:p>
@@ -2036,7 +1846,7 @@
           <w:sz w:val="22"/>
           <w:szCs w:val="22"/>
         </w:rPr>
-        <w:t xml:space="preserve">테스트할 역할에 맞는 카드를 클릭하면 자동 로그인됩니다.</w:t>
+        <w:t xml:space="preserve">테스트할 역할에 맞는 카드를 클릭하면 자동으로 로그인됩니다.</w:t>
       </w:r>
     </w:p>
     <w:p>
@@ -2053,7 +1863,7 @@
           <w:sz w:val="22"/>
           <w:szCs w:val="22"/>
         </w:rPr>
-        <w:t xml:space="preserve">로그인 후 좌측 사이드바에서 각 메뉴로 이동하여 테스트를 진행합니다.</w:t>
+        <w:t xml:space="preserve">로그인 후 왼쪽 메뉴에서 각 항목으로 이동하여 테스트를 진행합니다.</w:t>
       </w:r>
     </w:p>
     <w:p>
@@ -2070,7 +1880,7 @@
           <w:sz w:val="22"/>
           <w:szCs w:val="22"/>
         </w:rPr>
-        <w:t xml:space="preserve">다른 역할로 전환하려면 우측 상단 프로필 → 로그아웃 후 다른 카드를 선택합니다.</w:t>
+        <w:t xml:space="preserve">다른 역할로 바꾸려면 오른쪽 위 프로필 → 로그아웃 후 다른 카드를 클릭합니다.</w:t>
       </w:r>
     </w:p>
     <w:p>
@@ -2088,7 +1898,7 @@
           <w:sz w:val="22"/>
           <w:szCs w:val="22"/>
         </w:rPr>
-        <w:t xml:space="preserve">⚠ Production과의 차이: </w:t>
+        <w:t xml:space="preserve">⚠ 실제 운영 사이트와의 차이: </w:t>
       </w:r>
       <w:r>
         <w:rPr>
@@ -2096,7 +1906,7 @@
           <w:sz w:val="22"/>
           <w:szCs w:val="22"/>
         </w:rPr>
-        <w:t xml:space="preserve">Production(hr.ctr.co.kr)은 Microsoft 365 SSO 전용으로 운영되며, dev login 카드가 표시되지 않습니다. UAT는 Staging URL로 진행해야 9개 테스트 계정 사용이 가능합니다.</w:t>
+        <w:t xml:space="preserve">실제 운영 사이트(hr.ctr.co.kr)에서는 Microsoft 365 회사 계정으로만 로그인할 수 있고, 테스트 카드가 표시되지 않습니다. UAT 기간 동안은 반드시 이 가이드의 테스트 사이트 주소로 접속해 주세요.</w:t>
       </w:r>
     </w:p>
     <w:p>
@@ -2141,7 +1951,7 @@
           <w:sz w:val="22"/>
           <w:szCs w:val="22"/>
         </w:rPr>
-        <w:t xml:space="preserve">Staging 환경에서 dev login 카드로 즉시 전환 가능한 시드 계정입니다. 이메일만 입력하면 로그인되며, 비밀번호나 SSO 인증은 불필요합니다.</w:t>
+        <w:t xml:space="preserve">테스트 사이트의 로그인 화면에서 아래 카드를 클릭하면 즉시 해당 역할로 로그인됩니다. 비밀번호나 회사 계정 인증은 필요하지 않습니다.</w:t>
       </w:r>
     </w:p>
     <w:tbl>
@@ -2518,7 +2328,7 @@
                 <w:sz w:val="22"/>
                 <w:szCs w:val="22"/>
               </w:rPr>
-              <w:t xml:space="preserve">SUPER_ADMIN</w:t>
+              <w:t xml:space="preserve">전사관리자</w:t>
             </w:r>
           </w:p>
         </w:tc>
@@ -2730,7 +2540,7 @@
                 <w:sz w:val="22"/>
                 <w:szCs w:val="22"/>
               </w:rPr>
-              <w:t xml:space="preserve">HR_ADMIN</w:t>
+              <w:t xml:space="preserve">인사담당자</w:t>
             </w:r>
           </w:p>
         </w:tc>
@@ -2942,7 +2752,7 @@
                 <w:sz w:val="22"/>
                 <w:szCs w:val="22"/>
               </w:rPr>
-              <w:t xml:space="preserve">HR_ADMIN</w:t>
+              <w:t xml:space="preserve">인사담당자</w:t>
             </w:r>
           </w:p>
         </w:tc>
@@ -3154,7 +2964,7 @@
                 <w:sz w:val="22"/>
                 <w:szCs w:val="22"/>
               </w:rPr>
-              <w:t xml:space="preserve">MANAGER</w:t>
+              <w:t xml:space="preserve">팀장</w:t>
             </w:r>
           </w:p>
         </w:tc>
@@ -3366,7 +3176,7 @@
                 <w:sz w:val="22"/>
                 <w:szCs w:val="22"/>
               </w:rPr>
-              <w:t xml:space="preserve">MANAGER</w:t>
+              <w:t xml:space="preserve">팀장</w:t>
             </w:r>
           </w:p>
         </w:tc>
@@ -3578,7 +3388,7 @@
                 <w:sz w:val="22"/>
                 <w:szCs w:val="22"/>
               </w:rPr>
-              <w:t xml:space="preserve">EMPLOYEE</w:t>
+              <w:t xml:space="preserve">직원</w:t>
             </w:r>
           </w:p>
         </w:tc>
@@ -3790,7 +3600,7 @@
                 <w:sz w:val="22"/>
                 <w:szCs w:val="22"/>
               </w:rPr>
-              <w:t xml:space="preserve">EMPLOYEE</w:t>
+              <w:t xml:space="preserve">직원</w:t>
             </w:r>
           </w:p>
         </w:tc>
@@ -4002,7 +3812,7 @@
                 <w:sz w:val="22"/>
                 <w:szCs w:val="22"/>
               </w:rPr>
-              <w:t xml:space="preserve">EMPLOYEE</w:t>
+              <w:t xml:space="preserve">직원</w:t>
             </w:r>
           </w:p>
         </w:tc>
@@ -4214,7 +4024,7 @@
                 <w:sz w:val="22"/>
                 <w:szCs w:val="22"/>
               </w:rPr>
-              <w:t xml:space="preserve">EXECUTIVE</w:t>
+              <w:t xml:space="preserve">임원</w:t>
             </w:r>
           </w:p>
         </w:tc>
@@ -4412,7 +4222,7 @@
                 <w:sz w:val="22"/>
                 <w:szCs w:val="22"/>
               </w:rPr>
-              <w:t xml:space="preserve">EMPLOYEE</w:t>
+              <w:t xml:space="preserve">직원</w:t>
             </w:r>
           </w:p>
         </w:tc>
@@ -4445,7 +4255,7 @@
                 <w:sz w:val="22"/>
                 <w:szCs w:val="22"/>
               </w:rPr>
-              <w:t xml:space="preserve">MANAGER</w:t>
+              <w:t xml:space="preserve">팀장</w:t>
             </w:r>
           </w:p>
         </w:tc>
@@ -4478,7 +4288,7 @@
                 <w:sz w:val="22"/>
                 <w:szCs w:val="22"/>
               </w:rPr>
-              <w:t xml:space="preserve">EXECUTIVE</w:t>
+              <w:t xml:space="preserve">임원</w:t>
             </w:r>
           </w:p>
         </w:tc>
@@ -4511,7 +4321,7 @@
                 <w:sz w:val="22"/>
                 <w:szCs w:val="22"/>
               </w:rPr>
-              <w:t xml:space="preserve">HR_ADMIN</w:t>
+              <w:t xml:space="preserve">인사담당자</w:t>
             </w:r>
           </w:p>
         </w:tc>
@@ -4544,7 +4354,7 @@
                 <w:sz w:val="22"/>
                 <w:szCs w:val="22"/>
               </w:rPr>
-              <w:t xml:space="preserve">SUPER_ADMIN</w:t>
+              <w:t xml:space="preserve">전사관리자</w:t>
             </w:r>
           </w:p>
         </w:tc>
@@ -6318,7 +6128,7 @@
                 <w:sz w:val="22"/>
                 <w:szCs w:val="22"/>
               </w:rPr>
-              <w:t xml:space="preserve">직원 셀프서비스</w:t>
+              <w:t xml:space="preserve">직원 셀프서비스 (휴가/근태/내 정보)</w:t>
             </w:r>
           </w:p>
         </w:tc>
@@ -6380,7 +6190,7 @@
                 <w:sz w:val="22"/>
                 <w:szCs w:val="22"/>
               </w:rPr>
-              <w:t xml:space="preserve">매니저 기능</w:t>
+              <w:t xml:space="preserve">팀장 기능 (팀 관리/결재)</w:t>
             </w:r>
           </w:p>
         </w:tc>
@@ -6442,7 +6252,7 @@
                 <w:sz w:val="22"/>
                 <w:szCs w:val="22"/>
               </w:rPr>
-              <w:t xml:space="preserve">HR 관리 전체</w:t>
+              <w:t xml:space="preserve">인사 관리 전체</w:t>
             </w:r>
           </w:p>
         </w:tc>
@@ -6504,7 +6314,7 @@
                 <w:sz w:val="22"/>
                 <w:szCs w:val="22"/>
               </w:rPr>
-              <w:t xml:space="preserve">다국적 테스트</w:t>
+              <w:t xml:space="preserve">해외 법인 테스트 (중국)</w:t>
             </w:r>
           </w:p>
         </w:tc>
@@ -6566,7 +6376,7 @@
                 <w:sz w:val="22"/>
                 <w:szCs w:val="22"/>
               </w:rPr>
-              <w:t xml:space="preserve">임원 분석</w:t>
+              <w:t xml:space="preserve">임원 분석 대시보드</w:t>
             </w:r>
           </w:p>
         </w:tc>
@@ -6628,7 +6438,7 @@
                 <w:sz w:val="22"/>
                 <w:szCs w:val="22"/>
               </w:rPr>
-              <w:t xml:space="preserve">최고 관리자</w:t>
+              <w:t xml:space="preserve">전사 관리 (전 법인 권한)</w:t>
             </w:r>
           </w:p>
         </w:tc>
@@ -6682,7 +6492,7 @@
           <w:sz w:val="32"/>
           <w:szCs w:val="32"/>
         </w:rPr>
-        <w:t xml:space="preserve">5. V2 대시보드 화면 안내 (NEW)</w:t>
+        <w:t xml:space="preserve">5. 주요 화면 안내</w:t>
       </w:r>
     </w:p>
     <w:p>
@@ -6695,7 +6505,7 @@
           <w:sz w:val="22"/>
           <w:szCs w:val="22"/>
         </w:rPr>
-        <w:t xml:space="preserve">v1.0 → v2.0의 핵심 변경사항입니다. 홈 대시보드가 V2로 정식 승격(R4 promote 완료)되어 4개 역할별로 별도 레이아웃이 제공됩니다. 아래는 각 역할이 로그인 직후 보게 될 메인 화면입니다.</w:t>
+        <w:t xml:space="preserve">아래는 각 역할로 로그인했을 때 가장 먼저 보게 될 주요 화면입니다. 화면 구성을 미리 익혀두시면 테스트가 수월합니다.</w:t>
       </w:r>
     </w:p>
     <w:p>
@@ -6721,7 +6531,7 @@
           <w:sz w:val="22"/>
           <w:szCs w:val="22"/>
         </w:rPr>
-        <w:t xml:space="preserve">commit a5b0dade(2026-05-10) 시점, 1440×900 viewport, ko-KR locale, Light mode. Staging과 Production은 동일 코드 베이스이므로 화면 레이아웃은 일치합니다.</w:t>
+        <w:t xml:space="preserve">2026-05-10 기준, 한국어 화면, 일반 데스크톱 해상도. 화면 구성은 실제 운영 사이트와 동일합니다.</w:t>
       </w:r>
     </w:p>
     <w:p>
@@ -6750,7 +6560,7 @@
           <w:sz w:val="22"/>
           <w:szCs w:val="22"/>
         </w:rPr>
-        <w:t xml:space="preserve">로그인 직후 사용자가 가장 먼저 보는 화면입니다. 역할에 따라 노출되는 카드와 KPI가 달라집니다.</w:t>
+        <w:t xml:space="preserve">로그인 직후 가장 먼저 보이는 화면입니다. 역할에 따라 노출되는 카드와 지표가 달라집니다.</w:t>
       </w:r>
     </w:p>
     <w:p>
@@ -6766,7 +6576,7 @@
           <w:sz w:val="22"/>
           <w:szCs w:val="22"/>
         </w:rPr>
-        <w:t xml:space="preserve">5.1.1 EMPLOYEE — 이민준 (employee-a@ctr.co.kr)</w:t>
+        <w:t xml:space="preserve">5.1.1 직원 — 이민준 (employee-a@ctr.co.kr)</w:t>
       </w:r>
     </w:p>
     <w:p>
@@ -6779,7 +6589,7 @@
           <w:sz w:val="22"/>
           <w:szCs w:val="22"/>
         </w:rPr>
-        <w:t xml:space="preserve">직원이 보는 홈입니다. 본인 출근 상태, 휴가 잔액, 본인 작업(My Tasks), 알림이 핵심 카드로 노출됩니다.</w:t>
+        <w:t xml:space="preserve">일반 직원이 보는 홈 화면입니다. 본인 출근 상태, 휴가 잔여 일수, 본인 할 일, 알림이 주요 카드로 표시됩니다.</w:t>
       </w:r>
     </w:p>
     <w:p>
@@ -6792,7 +6602,7 @@
           <wp:inline distT="0" distB="0" distL="0" distR="0">
             <wp:extent cx="5943600" cy="3714750"/>
             <wp:effectExtent t="0" r="0" b="0" l="0"/>
-            <wp:docPr id="1" name="home-employee.png" descr="그림 5-1. EMPLOYEE 역할 홈 대시보드" title="그림 5-1. EMPLOYEE 역할 홈 대시보드"/>
+            <wp:docPr id="1" name="home-employee.png" descr="그림 5-1. 직원 역할 홈 화면" title="그림 5-1. 직원 역할 홈 화면"/>
             <wp:cNvGraphicFramePr>
               <a:graphicFrameLocks xmlns:a="http://schemas.openxmlformats.org/drawingml/2006/main" noChangeAspect="1"/>
             </wp:cNvGraphicFramePr>
@@ -6842,7 +6652,7 @@
           <w:sz w:val="20"/>
           <w:szCs w:val="20"/>
         </w:rPr>
-        <w:t xml:space="preserve">그림 5-1. EMPLOYEE 역할 홈 대시보드</w:t>
+        <w:t xml:space="preserve">그림 5-1. 직원 역할 홈 화면</w:t>
       </w:r>
     </w:p>
     <w:p>
@@ -6858,7 +6668,7 @@
           <w:sz w:val="22"/>
           <w:szCs w:val="22"/>
         </w:rPr>
-        <w:t xml:space="preserve">5.1.2 MANAGER — 박준혁 (manager@ctr.co.kr)</w:t>
+        <w:t xml:space="preserve">5.1.2 팀장 — 박준혁 (manager@ctr.co.kr)</w:t>
       </w:r>
     </w:p>
     <w:p>
@@ -6871,7 +6681,7 @@
           <w:sz w:val="22"/>
           <w:szCs w:val="22"/>
         </w:rPr>
-        <w:t xml:space="preserve">팀장이 보는 홈입니다. 팀 출근 현황, 결재 대기, 1:1 미팅 일정, 분기 평가 진행률이 카드로 표시됩니다.</w:t>
+        <w:t xml:space="preserve">팀장이 보는 홈 화면입니다. 팀 출근 현황, 결재 대기, 1:1 미팅 일정, 분기 평가 진행률이 표시됩니다.</w:t>
       </w:r>
     </w:p>
     <w:p>
@@ -6884,7 +6694,7 @@
           <wp:inline distT="0" distB="0" distL="0" distR="0">
             <wp:extent cx="5943600" cy="3714750"/>
             <wp:effectExtent t="0" r="0" b="0" l="0"/>
-            <wp:docPr id="1" name="home-manager.png" descr="그림 5-2. MANAGER 역할 홈 대시보드" title="그림 5-2. MANAGER 역할 홈 대시보드"/>
+            <wp:docPr id="1" name="home-manager.png" descr="그림 5-2. 팀장 역할 홈 화면" title="그림 5-2. 팀장 역할 홈 화면"/>
             <wp:cNvGraphicFramePr>
               <a:graphicFrameLocks xmlns:a="http://schemas.openxmlformats.org/drawingml/2006/main" noChangeAspect="1"/>
             </wp:cNvGraphicFramePr>
@@ -6934,7 +6744,7 @@
           <w:sz w:val="20"/>
           <w:szCs w:val="20"/>
         </w:rPr>
-        <w:t xml:space="preserve">그림 5-2. MANAGER 역할 홈 대시보드</w:t>
+        <w:t xml:space="preserve">그림 5-2. 팀장 역할 홈 화면</w:t>
       </w:r>
     </w:p>
     <w:p>
@@ -6950,7 +6760,7 @@
           <w:sz w:val="22"/>
           <w:szCs w:val="22"/>
         </w:rPr>
-        <w:t xml:space="preserve">5.1.3 HR_ADMIN — 한지영 (hr@ctr.co.kr)</w:t>
+        <w:t xml:space="preserve">5.1.3 인사담당자 — 한지영 (hr@ctr.co.kr)</w:t>
       </w:r>
     </w:p>
     <w:p>
@@ -6963,7 +6773,7 @@
           <w:sz w:val="22"/>
           <w:szCs w:val="22"/>
         </w:rPr>
-        <w:t xml:space="preserve">HR 담당자가 보는 홈입니다. 전사 출근 현황, 결재 대기, 온보딩/오프보딩 트래커, 휴가 통계가 노출됩니다.</w:t>
+        <w:t xml:space="preserve">인사 담당자가 보는 홈 화면입니다. 전사 출근 현황, 결재 대기, 입사/퇴사 진행 현황, 휴가 통계가 표시됩니다.</w:t>
       </w:r>
     </w:p>
     <w:p>
@@ -6976,7 +6786,7 @@
           <wp:inline distT="0" distB="0" distL="0" distR="0">
             <wp:extent cx="5943600" cy="3714750"/>
             <wp:effectExtent t="0" r="0" b="0" l="0"/>
-            <wp:docPr id="1" name="home-hr-admin.png" descr="그림 5-3. HR_ADMIN 역할 홈 대시보드" title="그림 5-3. HR_ADMIN 역할 홈 대시보드"/>
+            <wp:docPr id="1" name="home-hr-admin.png" descr="그림 5-3. 인사담당자 역할 홈 화면" title="그림 5-3. 인사담당자 역할 홈 화면"/>
             <wp:cNvGraphicFramePr>
               <a:graphicFrameLocks xmlns:a="http://schemas.openxmlformats.org/drawingml/2006/main" noChangeAspect="1"/>
             </wp:cNvGraphicFramePr>
@@ -7026,7 +6836,7 @@
           <w:sz w:val="20"/>
           <w:szCs w:val="20"/>
         </w:rPr>
-        <w:t xml:space="preserve">그림 5-3. HR_ADMIN 역할 홈 대시보드</w:t>
+        <w:t xml:space="preserve">그림 5-3. 인사담당자 역할 홈 화면</w:t>
       </w:r>
     </w:p>
     <w:p>
@@ -7042,7 +6852,7 @@
           <w:sz w:val="22"/>
           <w:szCs w:val="22"/>
         </w:rPr>
-        <w:t xml:space="preserve">5.1.4 SUPER_ADMIN — 대조영 (super@ctr.co.kr)</w:t>
+        <w:t xml:space="preserve">5.1.4 전사관리자 — 대조영 (super@ctr.co.kr)</w:t>
       </w:r>
     </w:p>
     <w:p>
@@ -7055,7 +6865,7 @@
           <w:sz w:val="22"/>
           <w:szCs w:val="22"/>
         </w:rPr>
-        <w:t xml:space="preserve">지주사 최고 관리자가 보는 홈입니다. 전 법인 통합 KPI, 회사 스위처(cross-company), 시스템 알림이 표시됩니다.</w:t>
+        <w:t xml:space="preserve">지주사 차원의 최고 관리자가 보는 홈 화면입니다. 전 법인 통합 지표, 회사 전환 메뉴, 시스템 공지가 표시됩니다.</w:t>
       </w:r>
     </w:p>
     <w:p>
@@ -7068,7 +6878,7 @@
           <wp:inline distT="0" distB="0" distL="0" distR="0">
             <wp:extent cx="5943600" cy="3714750"/>
             <wp:effectExtent t="0" r="0" b="0" l="0"/>
-            <wp:docPr id="1" name="home-super-admin.png" descr="그림 5-4. SUPER_ADMIN 역할 홈 대시보드" title="그림 5-4. SUPER_ADMIN 역할 홈 대시보드"/>
+            <wp:docPr id="1" name="home-super-admin.png" descr="그림 5-4. 전사관리자 역할 홈 화면" title="그림 5-4. 전사관리자 역할 홈 화면"/>
             <wp:cNvGraphicFramePr>
               <a:graphicFrameLocks xmlns:a="http://schemas.openxmlformats.org/drawingml/2006/main" noChangeAspect="1"/>
             </wp:cNvGraphicFramePr>
@@ -7118,7 +6928,7 @@
           <w:sz w:val="20"/>
           <w:szCs w:val="20"/>
         </w:rPr>
-        <w:t xml:space="preserve">그림 5-4. SUPER_ADMIN 역할 홈 대시보드</w:t>
+        <w:t xml:space="preserve">그림 5-4. 전사관리자 역할 홈 화면</w:t>
       </w:r>
     </w:p>
     <w:p>
@@ -7139,7 +6949,7 @@
           <w:sz w:val="26"/>
           <w:szCs w:val="26"/>
         </w:rPr>
-        <w:t xml:space="preserve">5.2 결재함 (Approvals Inbox)</w:t>
+        <w:t xml:space="preserve">5.2 결재함</w:t>
       </w:r>
     </w:p>
     <w:p>
@@ -7152,7 +6962,7 @@
           <w:sz w:val="22"/>
           <w:szCs w:val="22"/>
         </w:rPr>
-        <w:t xml:space="preserve">역할별 결재 대기 목록입니다. EMPLOYEE는 본인 신청 건만 보이고, MANAGER/HR_ADMIN은 결재 대기 + 본인 신청 둘 다 보입니다.</w:t>
+        <w:t xml:space="preserve">역할별 결재 대기 목록입니다. 직원은 본인이 올린 신청 건만 보이고, 팀장/인사담당자는 결재 대기 건과 본인이 올린 건이 함께 보입니다.</w:t>
       </w:r>
     </w:p>
     <w:p>
@@ -7168,7 +6978,7 @@
           <w:sz w:val="22"/>
           <w:szCs w:val="22"/>
         </w:rPr>
-        <w:t xml:space="preserve">5.2.1 EMPLOYEE 결재함</w:t>
+        <w:t xml:space="preserve">5.2.1 직원 결재함</w:t>
       </w:r>
     </w:p>
     <w:p>
@@ -7181,7 +6991,7 @@
           <wp:inline distT="0" distB="0" distL="0" distR="0">
             <wp:extent cx="5943600" cy="3714750"/>
             <wp:effectExtent t="0" r="0" b="0" l="0"/>
-            <wp:docPr id="1" name="approvals-inbox-employee.png" descr="그림 5-5. EMPLOYEE 역할 결재함" title="그림 5-5. EMPLOYEE 역할 결재함"/>
+            <wp:docPr id="1" name="approvals-inbox-employee.png" descr="그림 5-5. 직원 역할 결재함" title="그림 5-5. 직원 역할 결재함"/>
             <wp:cNvGraphicFramePr>
               <a:graphicFrameLocks xmlns:a="http://schemas.openxmlformats.org/drawingml/2006/main" noChangeAspect="1"/>
             </wp:cNvGraphicFramePr>
@@ -7231,7 +7041,7 @@
           <w:sz w:val="20"/>
           <w:szCs w:val="20"/>
         </w:rPr>
-        <w:t xml:space="preserve">그림 5-5. EMPLOYEE 역할 결재함</w:t>
+        <w:t xml:space="preserve">그림 5-5. 직원 역할 결재함</w:t>
       </w:r>
     </w:p>
     <w:p>
@@ -7247,7 +7057,7 @@
           <w:sz w:val="22"/>
           <w:szCs w:val="22"/>
         </w:rPr>
-        <w:t xml:space="preserve">5.2.2 MANAGER 결재함</w:t>
+        <w:t xml:space="preserve">5.2.2 팀장 결재함</w:t>
       </w:r>
     </w:p>
     <w:p>
@@ -7260,7 +7070,7 @@
           <wp:inline distT="0" distB="0" distL="0" distR="0">
             <wp:extent cx="5943600" cy="3714750"/>
             <wp:effectExtent t="0" r="0" b="0" l="0"/>
-            <wp:docPr id="1" name="approvals-inbox-manager.png" descr="그림 5-6. MANAGER 역할 결재함" title="그림 5-6. MANAGER 역할 결재함"/>
+            <wp:docPr id="1" name="approvals-inbox-manager.png" descr="그림 5-6. 팀장 역할 결재함" title="그림 5-6. 팀장 역할 결재함"/>
             <wp:cNvGraphicFramePr>
               <a:graphicFrameLocks xmlns:a="http://schemas.openxmlformats.org/drawingml/2006/main" noChangeAspect="1"/>
             </wp:cNvGraphicFramePr>
@@ -7310,7 +7120,7 @@
           <w:sz w:val="20"/>
           <w:szCs w:val="20"/>
         </w:rPr>
-        <w:t xml:space="preserve">그림 5-6. MANAGER 역할 결재함</w:t>
+        <w:t xml:space="preserve">그림 5-6. 팀장 역할 결재함</w:t>
       </w:r>
     </w:p>
     <w:p>
@@ -7326,7 +7136,7 @@
           <w:sz w:val="22"/>
           <w:szCs w:val="22"/>
         </w:rPr>
-        <w:t xml:space="preserve">5.2.3 HR_ADMIN 결재함</w:t>
+        <w:t xml:space="preserve">5.2.3 인사담당자 결재함</w:t>
       </w:r>
     </w:p>
     <w:p>
@@ -7339,7 +7149,7 @@
           <wp:inline distT="0" distB="0" distL="0" distR="0">
             <wp:extent cx="5943600" cy="3714750"/>
             <wp:effectExtent t="0" r="0" b="0" l="0"/>
-            <wp:docPr id="1" name="approvals-inbox-hr-admin.png" descr="그림 5-7. HR_ADMIN 역할 결재함" title="그림 5-7. HR_ADMIN 역할 결재함"/>
+            <wp:docPr id="1" name="approvals-inbox-hr-admin.png" descr="그림 5-7. 인사담당자 역할 결재함" title="그림 5-7. 인사담당자 역할 결재함"/>
             <wp:cNvGraphicFramePr>
               <a:graphicFrameLocks xmlns:a="http://schemas.openxmlformats.org/drawingml/2006/main" noChangeAspect="1"/>
             </wp:cNvGraphicFramePr>
@@ -7389,7 +7199,7 @@
           <w:sz w:val="20"/>
           <w:szCs w:val="20"/>
         </w:rPr>
-        <w:t xml:space="preserve">그림 5-7. HR_ADMIN 역할 결재함</w:t>
+        <w:t xml:space="preserve">그림 5-7. 인사담당자 역할 결재함</w:t>
       </w:r>
     </w:p>
     <w:p>
@@ -7405,7 +7215,7 @@
           <w:sz w:val="22"/>
           <w:szCs w:val="22"/>
         </w:rPr>
-        <w:t xml:space="preserve">5.2.4 SUPER_ADMIN 결재함</w:t>
+        <w:t xml:space="preserve">5.2.4 전사관리자 결재함</w:t>
       </w:r>
     </w:p>
     <w:p>
@@ -7418,7 +7228,7 @@
           <wp:inline distT="0" distB="0" distL="0" distR="0">
             <wp:extent cx="5943600" cy="3714750"/>
             <wp:effectExtent t="0" r="0" b="0" l="0"/>
-            <wp:docPr id="1" name="approvals-inbox-super-admin.png" descr="그림 5-8. SUPER_ADMIN 역할 결재함" title="그림 5-8. SUPER_ADMIN 역할 결재함"/>
+            <wp:docPr id="1" name="approvals-inbox-super-admin.png" descr="그림 5-8. 전사관리자 역할 결재함" title="그림 5-8. 전사관리자 역할 결재함"/>
             <wp:cNvGraphicFramePr>
               <a:graphicFrameLocks xmlns:a="http://schemas.openxmlformats.org/drawingml/2006/main" noChangeAspect="1"/>
             </wp:cNvGraphicFramePr>
@@ -7468,7 +7278,7 @@
           <w:sz w:val="20"/>
           <w:szCs w:val="20"/>
         </w:rPr>
-        <w:t xml:space="preserve">그림 5-8. SUPER_ADMIN 역할 결재함</w:t>
+        <w:t xml:space="preserve">그림 5-8. 전사관리자 역할 결재함</w:t>
       </w:r>
     </w:p>
     <w:p>
@@ -7502,7 +7312,7 @@
           <w:sz w:val="22"/>
           <w:szCs w:val="22"/>
         </w:rPr>
-        <w:t xml:space="preserve">역할별 시스템 알림 목록입니다. 결재 알림, 일정 알림, 시스템 공지가 통합되어 표시됩니다.</w:t>
+        <w:t xml:space="preserve">역할별 알림 목록입니다. 결재 알림, 일정 알림, 시스템 공지가 한 곳에서 통합 표시됩니다.</w:t>
       </w:r>
     </w:p>
     <w:p>
@@ -7518,7 +7328,7 @@
           <w:sz w:val="22"/>
           <w:szCs w:val="22"/>
         </w:rPr>
-        <w:t xml:space="preserve">5.3.1 EMPLOYEE 알림</w:t>
+        <w:t xml:space="preserve">5.3.1 직원 알림</w:t>
       </w:r>
     </w:p>
     <w:p>
@@ -7531,7 +7341,7 @@
           <wp:inline distT="0" distB="0" distL="0" distR="0">
             <wp:extent cx="5943600" cy="3714750"/>
             <wp:effectExtent t="0" r="0" b="0" l="0"/>
-            <wp:docPr id="1" name="notifications-employee.png" descr="그림 5-9. EMPLOYEE 역할 알림" title="그림 5-9. EMPLOYEE 역할 알림"/>
+            <wp:docPr id="1" name="notifications-employee.png" descr="그림 5-9. 직원 역할 알림" title="그림 5-9. 직원 역할 알림"/>
             <wp:cNvGraphicFramePr>
               <a:graphicFrameLocks xmlns:a="http://schemas.openxmlformats.org/drawingml/2006/main" noChangeAspect="1"/>
             </wp:cNvGraphicFramePr>
@@ -7581,7 +7391,7 @@
           <w:sz w:val="20"/>
           <w:szCs w:val="20"/>
         </w:rPr>
-        <w:t xml:space="preserve">그림 5-9. EMPLOYEE 역할 알림</w:t>
+        <w:t xml:space="preserve">그림 5-9. 직원 역할 알림</w:t>
       </w:r>
     </w:p>
     <w:p>
@@ -7597,7 +7407,7 @@
           <w:sz w:val="22"/>
           <w:szCs w:val="22"/>
         </w:rPr>
-        <w:t xml:space="preserve">5.3.2 MANAGER 알림</w:t>
+        <w:t xml:space="preserve">5.3.2 팀장 알림</w:t>
       </w:r>
     </w:p>
     <w:p>
@@ -7610,7 +7420,7 @@
           <wp:inline distT="0" distB="0" distL="0" distR="0">
             <wp:extent cx="5943600" cy="3714750"/>
             <wp:effectExtent t="0" r="0" b="0" l="0"/>
-            <wp:docPr id="1" name="notifications-manager.png" descr="그림 5-10. MANAGER 역할 알림" title="그림 5-10. MANAGER 역할 알림"/>
+            <wp:docPr id="1" name="notifications-manager.png" descr="그림 5-10. 팀장 역할 알림" title="그림 5-10. 팀장 역할 알림"/>
             <wp:cNvGraphicFramePr>
               <a:graphicFrameLocks xmlns:a="http://schemas.openxmlformats.org/drawingml/2006/main" noChangeAspect="1"/>
             </wp:cNvGraphicFramePr>
@@ -7660,7 +7470,7 @@
           <w:sz w:val="20"/>
           <w:szCs w:val="20"/>
         </w:rPr>
-        <w:t xml:space="preserve">그림 5-10. MANAGER 역할 알림</w:t>
+        <w:t xml:space="preserve">그림 5-10. 팀장 역할 알림</w:t>
       </w:r>
     </w:p>
     <w:p>
@@ -7676,7 +7486,7 @@
           <w:sz w:val="22"/>
           <w:szCs w:val="22"/>
         </w:rPr>
-        <w:t xml:space="preserve">5.3.3 HR_ADMIN 알림</w:t>
+        <w:t xml:space="preserve">5.3.3 인사담당자 알림</w:t>
       </w:r>
     </w:p>
     <w:p>
@@ -7689,7 +7499,7 @@
           <wp:inline distT="0" distB="0" distL="0" distR="0">
             <wp:extent cx="5943600" cy="3714750"/>
             <wp:effectExtent t="0" r="0" b="0" l="0"/>
-            <wp:docPr id="1" name="notifications-hr-admin.png" descr="그림 5-11. HR_ADMIN 역할 알림" title="그림 5-11. HR_ADMIN 역할 알림"/>
+            <wp:docPr id="1" name="notifications-hr-admin.png" descr="그림 5-11. 인사담당자 역할 알림" title="그림 5-11. 인사담당자 역할 알림"/>
             <wp:cNvGraphicFramePr>
               <a:graphicFrameLocks xmlns:a="http://schemas.openxmlformats.org/drawingml/2006/main" noChangeAspect="1"/>
             </wp:cNvGraphicFramePr>
@@ -7739,7 +7549,7 @@
           <w:sz w:val="20"/>
           <w:szCs w:val="20"/>
         </w:rPr>
-        <w:t xml:space="preserve">그림 5-11. HR_ADMIN 역할 알림</w:t>
+        <w:t xml:space="preserve">그림 5-11. 인사담당자 역할 알림</w:t>
       </w:r>
     </w:p>
     <w:p>
@@ -7755,7 +7565,7 @@
           <w:sz w:val="22"/>
           <w:szCs w:val="22"/>
         </w:rPr>
-        <w:t xml:space="preserve">5.3.4 SUPER_ADMIN 알림</w:t>
+        <w:t xml:space="preserve">5.3.4 전사관리자 알림</w:t>
       </w:r>
     </w:p>
     <w:p>
@@ -7768,7 +7578,7 @@
           <wp:inline distT="0" distB="0" distL="0" distR="0">
             <wp:extent cx="5943600" cy="3714750"/>
             <wp:effectExtent t="0" r="0" b="0" l="0"/>
-            <wp:docPr id="1" name="notifications-super-admin.png" descr="그림 5-12. SUPER_ADMIN 역할 알림" title="그림 5-12. SUPER_ADMIN 역할 알림"/>
+            <wp:docPr id="1" name="notifications-super-admin.png" descr="그림 5-12. 전사관리자 역할 알림" title="그림 5-12. 전사관리자 역할 알림"/>
             <wp:cNvGraphicFramePr>
               <a:graphicFrameLocks xmlns:a="http://schemas.openxmlformats.org/drawingml/2006/main" noChangeAspect="1"/>
             </wp:cNvGraphicFramePr>
@@ -7818,7 +7628,7 @@
           <w:sz w:val="20"/>
           <w:szCs w:val="20"/>
         </w:rPr>
-        <w:t xml:space="preserve">그림 5-12. SUPER_ADMIN 역할 알림</w:t>
+        <w:t xml:space="preserve">그림 5-12. 전사관리자 역할 알림</w:t>
       </w:r>
     </w:p>
     <w:p>
@@ -7834,7 +7644,7 @@
           <w:sz w:val="32"/>
           <w:szCs w:val="32"/>
         </w:rPr>
-        <w:t xml:space="preserve">6. 테스트 데이터 카탈로그</w:t>
+        <w:t xml:space="preserve">6. 테스트 데이터 안내</w:t>
       </w:r>
     </w:p>
     <w:p>
@@ -7850,7 +7660,7 @@
           <w:sz w:val="26"/>
           <w:szCs w:val="26"/>
         </w:rPr>
-        <w:t xml:space="preserve">6.1 엣지케이스 페르소나 (30명)</w:t>
+        <w:t xml:space="preserve">6.1 특수 상황 테스트 직원 (30명)</w:t>
       </w:r>
     </w:p>
     <w:p>
@@ -7863,7 +7673,7 @@
           <w:sz w:val="22"/>
           <w:szCs w:val="22"/>
         </w:rPr>
-        <w:t xml:space="preserve">시스템에는 비정상 상황을 시뮬레이션하기 위한 30명의 특수 직원이 등록되어 있습니다. 아래는 주요 엣지케이스 페르소나입니다.</w:t>
+        <w:t xml:space="preserve">실제 인사 업무에서 자주 발생하는 까다로운 상황을 점검할 수 있도록 30명의 특수 상황 가상 직원이 미리 등록되어 있습니다. 아래는 대표 사례입니다.</w:t>
       </w:r>
     </w:p>
     <w:p>
@@ -7879,7 +7689,7 @@
           <w:sz w:val="22"/>
           <w:szCs w:val="22"/>
         </w:rPr>
-        <w:t xml:space="preserve">고용 상태 엣지케이스 (8명)</w:t>
+        <w:t xml:space="preserve">고용 상태 관련 (8명)</w:t>
       </w:r>
     </w:p>
     <w:tbl>
@@ -9027,7 +8837,7 @@
           <w:sz w:val="22"/>
           <w:szCs w:val="22"/>
         </w:rPr>
-        <w:t xml:space="preserve">조직 엣지케이스 (일부)</w:t>
+        <w:t xml:space="preserve">조직 구성 관련 (일부)</w:t>
       </w:r>
     </w:p>
     <w:tbl>
@@ -9440,7 +9250,7 @@
           <w:sz w:val="22"/>
           <w:szCs w:val="22"/>
         </w:rPr>
-        <w:t xml:space="preserve">※ 나머지 엣지케이스는 테스트북 엣지케이스 시트를 참고해 주세요.</w:t>
+        <w:t xml:space="preserve">※ 나머지 특수 상황 직원은 별도 테스트북 파일의 특수 상황 시트를 참고해 주세요.</w:t>
       </w:r>
     </w:p>
     <w:p>
@@ -9910,7 +9720,7 @@
                 <w:sz w:val="22"/>
                 <w:szCs w:val="22"/>
               </w:rPr>
-              <w:t xml:space="preserve">Critical</w:t>
+              <w:t xml:space="preserve">치명적 (Critical)</w:t>
             </w:r>
           </w:p>
         </w:tc>
@@ -9970,7 +9780,7 @@
                 <w:sz w:val="22"/>
                 <w:szCs w:val="22"/>
               </w:rPr>
-              <w:t xml:space="preserve">로그인 불가, 급여 계산 오류, 타 법인 데이터 노출</w:t>
+              <w:t xml:space="preserve">로그인 불가, 급여 계산 오류, 다른 법인 데이터가 보임</w:t>
             </w:r>
           </w:p>
         </w:tc>
@@ -10002,7 +9812,7 @@
                 <w:sz w:val="22"/>
                 <w:szCs w:val="22"/>
               </w:rPr>
-              <w:t xml:space="preserve">Major</w:t>
+              <w:t xml:space="preserve">중대 (Major)</w:t>
             </w:r>
           </w:p>
         </w:tc>
@@ -10032,7 +9842,7 @@
                 <w:sz w:val="22"/>
                 <w:szCs w:val="22"/>
               </w:rPr>
-              <w:t xml:space="preserve">핵심 업무 수행 방해, 우회 방법 없음</w:t>
+              <w:t xml:space="preserve">핵심 업무 수행 불가, 우회 방법 없음</w:t>
             </w:r>
           </w:p>
         </w:tc>
@@ -10094,7 +9904,7 @@
                 <w:sz w:val="22"/>
                 <w:szCs w:val="22"/>
               </w:rPr>
-              <w:t xml:space="preserve">Minor</w:t>
+              <w:t xml:space="preserve">경미 (Minor)</w:t>
             </w:r>
           </w:p>
         </w:tc>
@@ -10124,7 +9934,7 @@
                 <w:sz w:val="22"/>
                 <w:szCs w:val="22"/>
               </w:rPr>
-              <w:t xml:space="preserve">불편하지만 우회 가능</w:t>
+              <w:t xml:space="preserve">불편하지만 다른 방법으로 진행 가능</w:t>
             </w:r>
           </w:p>
         </w:tc>
@@ -10154,7 +9964,7 @@
                 <w:sz w:val="22"/>
                 <w:szCs w:val="22"/>
               </w:rPr>
-              <w:t xml:space="preserve">UI 정렬 깨짐, 번역 누락, 느린 로딩</w:t>
+              <w:t xml:space="preserve">화면 정렬 어긋남, 번역 누락, 로딩이 느림</w:t>
             </w:r>
           </w:p>
         </w:tc>
@@ -10186,7 +9996,7 @@
                 <w:sz w:val="22"/>
                 <w:szCs w:val="22"/>
               </w:rPr>
-              <w:t xml:space="preserve">개선</w:t>
+              <w:t xml:space="preserve">개선 제안</w:t>
             </w:r>
           </w:p>
         </w:tc>
@@ -10216,7 +10026,7 @@
                 <w:sz w:val="22"/>
                 <w:szCs w:val="22"/>
               </w:rPr>
-              <w:t xml:space="preserve">기능 개선 제안</w:t>
+              <w:t xml:space="preserve">기능 개선 아이디어</w:t>
             </w:r>
           </w:p>
         </w:tc>
@@ -10246,7 +10056,7 @@
                 <w:sz w:val="22"/>
                 <w:szCs w:val="22"/>
               </w:rPr>
-              <w:t xml:space="preserve">UX 개선, 추가 필터 요청, 라벨 변경</w:t>
+              <w:t xml:space="preserve">사용성 개선, 필터 추가 요청, 라벨 변경</w:t>
             </w:r>
           </w:p>
         </w:tc>
@@ -10278,7 +10088,7 @@
           <w:sz w:val="22"/>
           <w:szCs w:val="22"/>
         </w:rPr>
-        <w:t xml:space="preserve">이슈 발견 시 피드백 Excel 파일에 아래 정보를 기입합니다. 정확한 재현 정보가 빠른 수정의 핵심입니다.</w:t>
+        <w:t xml:space="preserve">이슈가 발견되면 별도 피드백 Excel 파일에 아래 정보를 기록해 주세요. 재현 절차가 정확할수록 수정이 빨라집니다.</w:t>
       </w:r>
     </w:p>
     <w:tbl>
@@ -10859,7 +10669,7 @@
                 <w:sz w:val="22"/>
                 <w:szCs w:val="22"/>
               </w:rPr>
-              <w:t xml:space="preserve">현재 페이지 URL</w:t>
+              <w:t xml:space="preserve">현재 페이지 주소</w:t>
             </w:r>
           </w:p>
         </w:tc>
@@ -10981,7 +10791,7 @@
                 <w:sz w:val="22"/>
                 <w:szCs w:val="22"/>
               </w:rPr>
-              <w:t xml:space="preserve">재현 스텝</w:t>
+              <w:t xml:space="preserve">재현 절차</w:t>
             </w:r>
           </w:p>
         </w:tc>
@@ -11011,7 +10821,7 @@
                 <w:sz w:val="22"/>
                 <w:szCs w:val="22"/>
               </w:rPr>
-              <w:t xml:space="preserve">단계별 조작 과정</w:t>
+              <w:t xml:space="preserve">클릭/입력 등 단계별 조작 과정</w:t>
             </w:r>
           </w:p>
         </w:tc>
@@ -11133,7 +10943,7 @@
                 <w:sz w:val="22"/>
                 <w:szCs w:val="22"/>
               </w:rPr>
-              <w:t xml:space="preserve">무엇이 되어야 하는지</w:t>
+              <w:t xml:space="preserve">원래는 어떻게 되어야 하는지</w:t>
             </w:r>
           </w:p>
         </w:tc>
@@ -11163,7 +10973,7 @@
                 <w:sz w:val="22"/>
                 <w:szCs w:val="22"/>
               </w:rPr>
-              <w:t xml:space="preserve">휴가 신청 완료 메시지 표시</w:t>
+              <w:t xml:space="preserve">"휴가 신청 완료" 메시지가 표시되어야 함</w:t>
             </w:r>
           </w:p>
         </w:tc>
@@ -11255,7 +11065,7 @@
                 <w:sz w:val="22"/>
                 <w:szCs w:val="22"/>
               </w:rPr>
-              <w:t xml:space="preserve">실제로 무엇이 일어났는지</w:t>
+              <w:t xml:space="preserve">실제로 어떤 일이 일어났는지</w:t>
             </w:r>
           </w:p>
         </w:tc>
@@ -11285,7 +11095,7 @@
                 <w:sz w:val="22"/>
                 <w:szCs w:val="22"/>
               </w:rPr>
-              <w:t xml:space="preserve">에러 메시지: "서버 오류"</w:t>
+              <w:t xml:space="preserve">오류 메시지가 표시됨: "서버 오류"</w:t>
             </w:r>
           </w:p>
         </w:tc>
@@ -11377,7 +11187,7 @@
                 <w:sz w:val="22"/>
                 <w:szCs w:val="22"/>
               </w:rPr>
-              <w:t xml:space="preserve">위 기준 참고</w:t>
+              <w:t xml:space="preserve">위 7번 섹션의 기준 참고</w:t>
             </w:r>
           </w:p>
         </w:tc>
@@ -11407,7 +11217,7 @@
                 <w:sz w:val="22"/>
                 <w:szCs w:val="22"/>
               </w:rPr>
-              <w:t xml:space="preserve">Major</w:t>
+              <w:t xml:space="preserve">중대 (Major)</w:t>
             </w:r>
           </w:p>
         </w:tc>
@@ -11469,7 +11279,7 @@
                 <w:sz w:val="22"/>
                 <w:szCs w:val="22"/>
               </w:rPr>
-              <w:t xml:space="preserve">스크린샷</w:t>
+              <w:t xml:space="preserve">화면 캡처</w:t>
             </w:r>
           </w:p>
         </w:tc>
@@ -11499,7 +11309,7 @@
                 <w:sz w:val="22"/>
                 <w:szCs w:val="22"/>
               </w:rPr>
-              <w:t xml:space="preserve">가능하면 첨부 (Print Screen → Excel 붙여넣기)</w:t>
+              <w:t xml:space="preserve">가능하면 첨부 (PrintScreen → Excel에 붙여넣기)</w:t>
             </w:r>
           </w:p>
         </w:tc>
@@ -11561,28 +11371,7 @@
           <w:sz w:val="22"/>
           <w:szCs w:val="22"/>
         </w:rPr>
-        <w:t xml:space="preserve">아래 항목들은 현재 개발 중이거나 의도된 동작입니다. 버그가 아니니 참고만 해주세요.</w:t>
-      </w:r>
-    </w:p>
-    <w:p>
-      <w:pPr>
-        <w:spacing w:after="100"/>
-        <w:rPr>
-          <w:i/>
-          <w:iCs/>
-          <w:color w:val="595959"/>
-        </w:rPr>
-      </w:pPr>
-      <w:r>
-        <w:rPr>
-          <w:rFonts w:ascii="Malgun Gothic" w:cs="Malgun Gothic" w:eastAsia="Malgun Gothic" w:hAnsi="Malgun Gothic"/>
-          <w:i/>
-          <w:iCs/>
-          <w:color w:val="595959"/>
-          <w:sz w:val="22"/>
-          <w:szCs w:val="22"/>
-        </w:rPr>
-        <w:t xml:space="preserve">v1.0 → v2.0: 8건 → 5건으로 감소했습니다 (Phase 9 회귀 안전망 batch 1-17 반영, E2E 137 → 14 fail).</w:t>
+        <w:t xml:space="preserve">아래 항목들은 현재 개발팀이 인지하고 있거나 의도된 동작입니다. 버그가 아니니 발견하셔도 따로 보고하지 않으셔도 됩니다.</w:t>
       </w:r>
     </w:p>
     <w:tbl>
@@ -11763,7 +11552,7 @@
                 <w:sz w:val="22"/>
                 <w:szCs w:val="22"/>
               </w:rPr>
-              <w:t xml:space="preserve">비정기 보상 이벤트 알림 미발송</w:t>
+              <w:t xml:space="preserve">비정기 보상 변경 알림 미발송</w:t>
             </w:r>
           </w:p>
         </w:tc>
@@ -11793,7 +11582,7 @@
                 <w:sz w:val="22"/>
                 <w:szCs w:val="22"/>
               </w:rPr>
-              <w:t xml:space="preserve">이벤트 버스 미구현. Off-cycle compensation의 submit/approve/reject 시 알림이 자동 발송되지 않음. (Session 207에서 trailing self-skip 회귀는 fix됨)</w:t>
+              <w:t xml:space="preserve">정기 보상 외 임시 보상 조정 시 결재 알림이 자동 발송되지 않습니다 (개발팀에서 별도 작업 중).</w:t>
             </w:r>
           </w:p>
         </w:tc>
@@ -11855,7 +11644,7 @@
                 <w:sz w:val="22"/>
                 <w:szCs w:val="22"/>
               </w:rPr>
-              <w:t xml:space="preserve">출퇴근 관리 에러 토스트 미표시</w:t>
+              <w:t xml:space="preserve">출퇴근 화면 일부 오류 메시지 누락</w:t>
             </w:r>
           </w:p>
         </w:tc>
@@ -11885,7 +11674,7 @@
                 <w:sz w:val="22"/>
                 <w:szCs w:val="22"/>
               </w:rPr>
-              <w:t xml:space="preserve">일부 오류 상황에서 사용자 알림이 뜨지 않음 (콘솔에만 기록)</w:t>
+              <w:t xml:space="preserve">특정 오류 상황에서 화면 알림이 표시되지 않을 수 있습니다.</w:t>
             </w:r>
           </w:p>
         </w:tc>
@@ -11947,7 +11736,7 @@
                 <w:sz w:val="22"/>
                 <w:szCs w:val="22"/>
               </w:rPr>
-              <w:t xml:space="preserve">발령일 타임존 비교 이슈</w:t>
+              <w:t xml:space="preserve">발령일 날짜 계산 1일 오차 가능</w:t>
             </w:r>
           </w:p>
         </w:tc>
@@ -11977,7 +11766,7 @@
                 <w:sz w:val="22"/>
                 <w:szCs w:val="22"/>
               </w:rPr>
-              <w:t xml:space="preserve">UTC vs 로컬 타임존 비교에서 경계값 차이 발생 가능 (1일 오차)</w:t>
+              <w:t xml:space="preserve">시간대 처리 차이로 인해 발령일이 1일 다르게 보일 수 있습니다.</w:t>
             </w:r>
           </w:p>
         </w:tc>
@@ -12039,7 +11828,7 @@
                 <w:sz w:val="22"/>
                 <w:szCs w:val="22"/>
               </w:rPr>
-              <w:t xml:space="preserve">Redis 캐시 키 불일치</w:t>
+              <w:t xml:space="preserve">법인 코드 변경 시 캐시 새로고침 필요</w:t>
             </w:r>
           </w:p>
         </w:tc>
@@ -12069,7 +11858,7 @@
                 <w:sz w:val="22"/>
                 <w:szCs w:val="22"/>
               </w:rPr>
-              <w:t xml:space="preserve">법인 코드 변경 시 수동 캐시 초기화 필요 (운영 배포 시 조치 예정)</w:t>
+              <w:t xml:space="preserve">법인 코드를 변경한 직후 화면이 즉시 반영되지 않을 수 있으며, 잠시 후 새로고침 시 정상 표시됩니다.</w:t>
             </w:r>
           </w:p>
         </w:tc>
@@ -12131,7 +11920,7 @@
                 <w:sz w:val="22"/>
                 <w:szCs w:val="22"/>
               </w:rPr>
-              <w:t xml:space="preserve">E2E API 12건 잔여 fail</w:t>
+              <w:t xml:space="preserve">일부 자동 검증 항목 점검 중</w:t>
             </w:r>
           </w:p>
         </w:tc>
@@ -12161,7 +11950,7 @@
                 <w:sz w:val="22"/>
                 <w:szCs w:val="22"/>
               </w:rPr>
-              <w:t xml:space="preserve">Phase 9 Cluster D — heterogeneous (503 rate limit / boolean assertion drift / 409 sequence / 500). 별도 batch에서 정리 중. UAT 시나리오에는 영향 없음.</w:t>
+              <w:t xml:space="preserve">내부 자동 점검 항목 중 일부가 별도 정리 작업 중이며, UAT 시나리오 진행에는 영향이 없습니다.</w:t>
             </w:r>
           </w:p>
         </w:tc>
@@ -12180,7 +11969,7 @@
           <w:sz w:val="32"/>
           <w:szCs w:val="32"/>
         </w:rPr>
-        <w:t xml:space="preserve">10. 통과 기준 &amp; 사인오프</w:t>
+        <w:t xml:space="preserve">10. 통과 기준 &amp; 최종 승인</w:t>
       </w:r>
     </w:p>
     <w:p>
@@ -12313,7 +12102,7 @@
                 <w:sz w:val="22"/>
                 <w:szCs w:val="22"/>
               </w:rPr>
-              <w:t xml:space="preserve">Critical 이슈</w:t>
+              <w:t xml:space="preserve">치명적 이슈 (Critical)</w:t>
             </w:r>
           </w:p>
         </w:tc>
@@ -12375,7 +12164,7 @@
                 <w:sz w:val="22"/>
                 <w:szCs w:val="22"/>
               </w:rPr>
-              <w:t xml:space="preserve">Major (핵심 모듈)</w:t>
+              <w:t xml:space="preserve">중대 이슈 (Major) — 핵심 모듈</w:t>
             </w:r>
           </w:p>
         </w:tc>
@@ -12437,7 +12226,7 @@
                 <w:sz w:val="22"/>
                 <w:szCs w:val="22"/>
               </w:rPr>
-              <w:t xml:space="preserve">Major (전체)</w:t>
+              <w:t xml:space="preserve">중대 이슈 (Major) — 전체</w:t>
             </w:r>
           </w:p>
         </w:tc>
@@ -12561,7 +12350,7 @@
                 <w:sz w:val="22"/>
                 <w:szCs w:val="22"/>
               </w:rPr>
-              <w:t xml:space="preserve">체크리스트 스모크 통과율</w:t>
+              <w:t xml:space="preserve">전체 체크리스트 통과율</w:t>
             </w:r>
           </w:p>
         </w:tc>
@@ -12653,7 +12442,7 @@
                 <w:sz w:val="22"/>
                 <w:szCs w:val="22"/>
               </w:rPr>
-              <w:t xml:space="preserve">0건 — 법인 격리, 급여 유출, 권한 누수</w:t>
+              <w:t xml:space="preserve">0건 — 법인 간 데이터 분리, 급여 정보 유출, 권한 누수</w:t>
             </w:r>
           </w:p>
         </w:tc>
@@ -12669,7 +12458,7 @@
           <w:sz w:val="22"/>
           <w:szCs w:val="22"/>
         </w:rPr>
-        <w:t xml:space="preserve">※ "해결됨" 정의: 수정 완료 → staging 배포 → 보고자 재테스트 → 종료</w:t>
+        <w:t xml:space="preserve">※ "해결됨" 정의: 수정 완료 → 테스트 사이트 반영 → 보고자가 재테스트 → 종료</w:t>
       </w:r>
     </w:p>
     <w:p>
@@ -12685,7 +12474,7 @@
           <w:sz w:val="26"/>
           <w:szCs w:val="26"/>
         </w:rPr>
-        <w:t xml:space="preserve">10.2 사인오프 양식</w:t>
+        <w:t xml:space="preserve">10.2 최종 승인 양식</w:t>
       </w:r>
     </w:p>
     <w:tbl>
@@ -13028,7 +12817,7 @@
                 <w:sz w:val="22"/>
                 <w:szCs w:val="22"/>
               </w:rPr>
-              <w:t xml:space="preserve">GO / NO-GO</w:t>
+              <w:t xml:space="preserve">승인 / 반려</w:t>
             </w:r>
           </w:p>
         </w:tc>
@@ -13210,7 +12999,7 @@
                 <w:sz w:val="22"/>
                 <w:szCs w:val="22"/>
               </w:rPr>
-              <w:t xml:space="preserve">GO / NO-GO</w:t>
+              <w:t xml:space="preserve">승인 / 반려</w:t>
             </w:r>
           </w:p>
         </w:tc>
@@ -13392,7 +13181,7 @@
                 <w:sz w:val="22"/>
                 <w:szCs w:val="22"/>
               </w:rPr>
-              <w:t xml:space="preserve">GO / NO-GO</w:t>
+              <w:t xml:space="preserve">승인 / 반려</w:t>
             </w:r>
           </w:p>
         </w:tc>
@@ -13574,7 +13363,7 @@
                 <w:sz w:val="22"/>
                 <w:szCs w:val="22"/>
               </w:rPr>
-              <w:t xml:space="preserve">GO / NO-GO</w:t>
+              <w:t xml:space="preserve">승인 / 반려</w:t>
             </w:r>
           </w:p>
         </w:tc>
@@ -13756,7 +13545,7 @@
                 <w:sz w:val="22"/>
                 <w:szCs w:val="22"/>
               </w:rPr>
-              <w:t xml:space="preserve">GO / NO-GO</w:t>
+              <w:t xml:space="preserve">승인 / 반려</w:t>
             </w:r>
           </w:p>
         </w:tc>
@@ -13938,7 +13727,7 @@
                 <w:sz w:val="22"/>
                 <w:szCs w:val="22"/>
               </w:rPr>
-              <w:t xml:space="preserve">GO / NO-GO</w:t>
+              <w:t xml:space="preserve">승인 / 반려</w:t>
             </w:r>
           </w:p>
         </w:tc>
@@ -14120,7 +13909,7 @@
                 <w:sz w:val="22"/>
                 <w:szCs w:val="22"/>
               </w:rPr>
-              <w:t xml:space="preserve">GO / NO-GO</w:t>
+              <w:t xml:space="preserve">승인 / 반려</w:t>
             </w:r>
           </w:p>
         </w:tc>
@@ -14212,7 +14001,7 @@
           <w:sz w:val="22"/>
           <w:szCs w:val="22"/>
         </w:rPr>
-        <w:t xml:space="preserve">☐  전체 GO — 운영 배포 진행</w:t>
+        <w:t xml:space="preserve">☐  전체 승인 — 운영 배포 진행</w:t>
       </w:r>
     </w:p>
     <w:p>
@@ -14225,7 +14014,7 @@
           <w:sz w:val="22"/>
           <w:szCs w:val="22"/>
         </w:rPr>
-        <w:t xml:space="preserve">☐  조건부 GO — 명시된 조건 해결 후 배포</w:t>
+        <w:t xml:space="preserve">☐  조건부 승인 — 명시된 조건 해결 후 배포</w:t>
       </w:r>
     </w:p>
     <w:p>
@@ -14238,7 +14027,7 @@
           <w:sz w:val="22"/>
           <w:szCs w:val="22"/>
         </w:rPr>
-        <w:t xml:space="preserve">☐  NO-GO — 재테스트 필요</w:t>
+        <w:t xml:space="preserve">☐  반려 — 재테스트 필요</w:t>
       </w:r>
     </w:p>
     <w:p>
@@ -14442,7 +14231,7 @@
         <w:sz w:val="18"/>
         <w:szCs w:val="18"/>
       </w:rPr>
-      <w:t xml:space="preserve">CTR HR Hub UAT 가이드 v2.0</w:t>
+      <w:t xml:space="preserve">CTR HR Hub UAT 가이드</w:t>
     </w:r>
   </w:p>
 </w:hdr>

</xml_diff>

<commit_message>
docs(uat): rewrite guide in HR-friendly language (#28)
CEO feedback after first review:
1. Remove v1→v2 change summary on cover — first delivery, no diff needed
2. UAT 관리자 '상우님' → '강상우' (full name with surname)
3. Replace developer jargon with plain Korean for HR audience:
   - Staging / Production → 테스트 사이트 / 실제 운영 사이트
   - dev login 카드 → 테스트 계정 카드
   - SSO → 회사 계정 로그인 / Microsoft 365 회사 계정
   - EMPLOYEE/MANAGER/EXECUTIVE/HR_ADMIN/SUPER_ADMIN
     → 직원/팀장/임원/인사담당자/전사관리자
   - 엣지케이스 페르소나 → 특수 상황 테스트 직원
   - 스모크 테스트 → 기본 동작 확인
   - 킥오프 / 워크스루 → 시작 미팅 / 안내
   - 트리아지 → 분류
   - 사인오프 → 최종 승인
   - GO / NO-GO → 승인 / 반려
   - Critical/Major/Minor → 치명적/중대/경미
   - Phase 9 batch / Cluster D / E2E fail → "내부 자동 점검 항목 중 일부"
   - commit hash / viewport / locale / Light mode → 캡처 기준 단순 설명
   - R4 promote / Vercel Preview / Redis 캐시 / UTC → 모두 제거 또는 평이한 표현

Header/footer/title에서 'v2.0' 제거. 첫 공식 배포로 표현 정리.

Co-authored-by: Claude Opus 4.7 (1M context) <noreply@anthropic.com>
</commit_message>
<xml_diff>
--- a/docs/uat/UAT_가이드_v2.docx
+++ b/docs/uat/UAT_가이드_v2.docx
@@ -46,7 +46,7 @@
           <w:sz w:val="28"/>
           <w:szCs w:val="28"/>
         </w:rPr>
-        <w:t xml:space="preserve">Version 2.0</w:t>
+        <w:t xml:space="preserve">핵심 업무 모듈 검증 가이드</w:t>
       </w:r>
     </w:p>
     <w:tbl>
@@ -163,7 +163,7 @@
                 <w:sz w:val="22"/>
                 <w:szCs w:val="22"/>
               </w:rPr>
-              <w:t xml:space="preserve">문서 버전</w:t>
+              <w:t xml:space="preserve">작성일</w:t>
             </w:r>
           </w:p>
         </w:tc>
@@ -193,7 +193,7 @@
                 <w:sz w:val="22"/>
                 <w:szCs w:val="22"/>
               </w:rPr>
-              <w:t xml:space="preserve">v2.0</w:t>
+              <w:t xml:space="preserve">2026년 5월 11일</w:t>
             </w:r>
           </w:p>
         </w:tc>
@@ -225,7 +225,7 @@
                 <w:sz w:val="22"/>
                 <w:szCs w:val="22"/>
               </w:rPr>
-              <w:t xml:space="preserve">작성일</w:t>
+              <w:t xml:space="preserve">작성자</w:t>
             </w:r>
           </w:p>
         </w:tc>
@@ -255,7 +255,7 @@
                 <w:sz w:val="22"/>
                 <w:szCs w:val="22"/>
               </w:rPr>
-              <w:t xml:space="preserve">2026년 5월 10일</w:t>
+              <w:t xml:space="preserve">CTR 개발팀</w:t>
             </w:r>
           </w:p>
         </w:tc>
@@ -287,7 +287,7 @@
                 <w:sz w:val="22"/>
                 <w:szCs w:val="22"/>
               </w:rPr>
-              <w:t xml:space="preserve">이전 버전</w:t>
+              <w:t xml:space="preserve">대상</w:t>
             </w:r>
           </w:p>
         </w:tc>
@@ -317,7 +317,7 @@
                 <w:sz w:val="22"/>
                 <w:szCs w:val="22"/>
               </w:rPr>
-              <w:t xml:space="preserve">v1.0 (2026-04-17)</w:t>
+              <w:t xml:space="preserve">인사 담당자 (UAT 테스터)</w:t>
             </w:r>
           </w:p>
         </w:tc>
@@ -349,130 +349,6 @@
                 <w:sz w:val="22"/>
                 <w:szCs w:val="22"/>
               </w:rPr>
-              <w:t xml:space="preserve">작성자</w:t>
-            </w:r>
-          </w:p>
-        </w:tc>
-        <w:tc>
-          <w:tcPr>
-            <w:tcW w:type="dxa" w:w="6360"/>
-            <w:tcBorders>
-              <w:top w:val="single" w:color="BFBFBF" w:sz="4"/>
-              <w:left w:val="single" w:color="BFBFBF" w:sz="4"/>
-              <w:bottom w:val="single" w:color="BFBFBF" w:sz="4"/>
-              <w:right w:val="single" w:color="BFBFBF" w:sz="4"/>
-            </w:tcBorders>
-            <w:tcMar>
-              <w:top w:type="dxa" w:w="100"/>
-              <w:left w:type="dxa" w:w="140"/>
-              <w:bottom w:type="dxa" w:w="100"/>
-              <w:right w:type="dxa" w:w="140"/>
-            </w:tcMar>
-          </w:tcPr>
-          <w:p>
-            <w:pPr>
-              <w:jc w:val="left"/>
-            </w:pPr>
-            <w:r>
-              <w:rPr>
-                <w:rFonts w:ascii="Malgun Gothic" w:cs="Malgun Gothic" w:eastAsia="Malgun Gothic" w:hAnsi="Malgun Gothic"/>
-                <w:sz w:val="22"/>
-                <w:szCs w:val="22"/>
-              </w:rPr>
-              <w:t xml:space="preserve">CTR 개발팀</w:t>
-            </w:r>
-          </w:p>
-        </w:tc>
-      </w:tr>
-      <w:tr>
-        <w:tc>
-          <w:tcPr>
-            <w:tcW w:type="dxa" w:w="3000"/>
-            <w:tcBorders>
-              <w:top w:val="single" w:color="BFBFBF" w:sz="4"/>
-              <w:left w:val="single" w:color="BFBFBF" w:sz="4"/>
-              <w:bottom w:val="single" w:color="BFBFBF" w:sz="4"/>
-              <w:right w:val="single" w:color="BFBFBF" w:sz="4"/>
-            </w:tcBorders>
-            <w:tcMar>
-              <w:top w:type="dxa" w:w="100"/>
-              <w:left w:type="dxa" w:w="140"/>
-              <w:bottom w:type="dxa" w:w="100"/>
-              <w:right w:type="dxa" w:w="140"/>
-            </w:tcMar>
-          </w:tcPr>
-          <w:p>
-            <w:pPr>
-              <w:jc w:val="left"/>
-            </w:pPr>
-            <w:r>
-              <w:rPr>
-                <w:rFonts w:ascii="Malgun Gothic" w:cs="Malgun Gothic" w:eastAsia="Malgun Gothic" w:hAnsi="Malgun Gothic"/>
-                <w:sz w:val="22"/>
-                <w:szCs w:val="22"/>
-              </w:rPr>
-              <w:t xml:space="preserve">대상</w:t>
-            </w:r>
-          </w:p>
-        </w:tc>
-        <w:tc>
-          <w:tcPr>
-            <w:tcW w:type="dxa" w:w="6360"/>
-            <w:tcBorders>
-              <w:top w:val="single" w:color="BFBFBF" w:sz="4"/>
-              <w:left w:val="single" w:color="BFBFBF" w:sz="4"/>
-              <w:bottom w:val="single" w:color="BFBFBF" w:sz="4"/>
-              <w:right w:val="single" w:color="BFBFBF" w:sz="4"/>
-            </w:tcBorders>
-            <w:tcMar>
-              <w:top w:type="dxa" w:w="100"/>
-              <w:left w:type="dxa" w:w="140"/>
-              <w:bottom w:type="dxa" w:w="100"/>
-              <w:right w:type="dxa" w:w="140"/>
-            </w:tcMar>
-          </w:tcPr>
-          <w:p>
-            <w:pPr>
-              <w:jc w:val="left"/>
-            </w:pPr>
-            <w:r>
-              <w:rPr>
-                <w:rFonts w:ascii="Malgun Gothic" w:cs="Malgun Gothic" w:eastAsia="Malgun Gothic" w:hAnsi="Malgun Gothic"/>
-                <w:sz w:val="22"/>
-                <w:szCs w:val="22"/>
-              </w:rPr>
-              <w:t xml:space="preserve">UAT 테스터 (HR 담당자)</w:t>
-            </w:r>
-          </w:p>
-        </w:tc>
-      </w:tr>
-      <w:tr>
-        <w:tc>
-          <w:tcPr>
-            <w:tcW w:type="dxa" w:w="3000"/>
-            <w:tcBorders>
-              <w:top w:val="single" w:color="BFBFBF" w:sz="4"/>
-              <w:left w:val="single" w:color="BFBFBF" w:sz="4"/>
-              <w:bottom w:val="single" w:color="BFBFBF" w:sz="4"/>
-              <w:right w:val="single" w:color="BFBFBF" w:sz="4"/>
-            </w:tcBorders>
-            <w:tcMar>
-              <w:top w:type="dxa" w:w="100"/>
-              <w:left w:type="dxa" w:w="140"/>
-              <w:bottom w:type="dxa" w:w="100"/>
-              <w:right w:type="dxa" w:w="140"/>
-            </w:tcMar>
-          </w:tcPr>
-          <w:p>
-            <w:pPr>
-              <w:jc w:val="left"/>
-            </w:pPr>
-            <w:r>
-              <w:rPr>
-                <w:rFonts w:ascii="Malgun Gothic" w:cs="Malgun Gothic" w:eastAsia="Malgun Gothic" w:hAnsi="Malgun Gothic"/>
-                <w:sz w:val="22"/>
-                <w:szCs w:val="22"/>
-              </w:rPr>
               <w:t xml:space="preserve">분류</w:t>
             </w:r>
           </w:p>
@@ -509,72 +385,6 @@
         </w:tc>
       </w:tr>
     </w:tbl>
-    <w:p>
-      <w:pPr>
-        <w:spacing w:after="120" w:before="360"/>
-      </w:pPr>
-      <w:r>
-        <w:rPr>
-          <w:rFonts w:ascii="Malgun Gothic" w:cs="Malgun Gothic" w:eastAsia="Malgun Gothic" w:hAnsi="Malgun Gothic"/>
-          <w:b/>
-          <w:bCs/>
-          <w:sz w:val="24"/>
-          <w:szCs w:val="24"/>
-        </w:rPr>
-        <w:t xml:space="preserve">v1.0 → v2.0 변경 요약</w:t>
-      </w:r>
-    </w:p>
-    <w:p>
-      <w:pPr>
-        <w:pStyle w:val="ListParagraph"/>
-        <w:numPr>
-          <w:ilvl w:val="0"/>
-          <w:numId w:val="2"/>
-        </w:numPr>
-      </w:pPr>
-      <w:r>
-        <w:rPr>
-          <w:rFonts w:ascii="Malgun Gothic" w:cs="Malgun Gothic" w:eastAsia="Malgun Gothic" w:hAnsi="Malgun Gothic"/>
-          <w:sz w:val="22"/>
-          <w:szCs w:val="22"/>
-        </w:rPr>
-        <w:t xml:space="preserve">홈 대시보드 V2 정식 승격 (R4 promote 완료) — 4개 역할별 신규 화면 캡처 추가</w:t>
-      </w:r>
-    </w:p>
-    <w:p>
-      <w:pPr>
-        <w:pStyle w:val="ListParagraph"/>
-        <w:numPr>
-          <w:ilvl w:val="0"/>
-          <w:numId w:val="2"/>
-        </w:numPr>
-      </w:pPr>
-      <w:r>
-        <w:rPr>
-          <w:rFonts w:ascii="Malgun Gothic" w:cs="Malgun Gothic" w:eastAsia="Malgun Gothic" w:hAnsi="Malgun Gothic"/>
-          <w:sz w:val="22"/>
-          <w:szCs w:val="22"/>
-        </w:rPr>
-        <w:t xml:space="preserve">테스트 환경: Staging (Vercel Preview) — dev login 카드로 9개 역할 전환 가능 (Production은 SSO-only로 분리)</w:t>
-      </w:r>
-    </w:p>
-    <w:p>
-      <w:pPr>
-        <w:pStyle w:val="ListParagraph"/>
-        <w:numPr>
-          <w:ilvl w:val="0"/>
-          <w:numId w:val="2"/>
-        </w:numPr>
-      </w:pPr>
-      <w:r>
-        <w:rPr>
-          <w:rFonts w:ascii="Malgun Gothic" w:cs="Malgun Gothic" w:eastAsia="Malgun Gothic" w:hAnsi="Malgun Gothic"/>
-          <w:sz w:val="22"/>
-          <w:szCs w:val="22"/>
-        </w:rPr>
-        <w:t xml:space="preserve">알려진 이슈 8개 → 5개로 감소 (Phase 9 회귀 안전망 batch 1-17 반영)</w:t>
-      </w:r>
-    </w:p>
     <w:p>
       <w:r>
         <w:br w:type="page"/>
@@ -651,7 +461,7 @@
           <w:sz w:val="22"/>
           <w:szCs w:val="22"/>
         </w:rPr>
-        <w:t xml:space="preserve">Round 1 — 핵심 업무 모듈(인사관리, 출퇴근, 휴가, 급여, 결재/승인, 설정)에 대한 심층 검증을 수행하고, 나머지 모듈(채용, 성과/보상, 인사이트 등)에 대해서는 스모크 테스트로 기본 동작을 확인합니다.</w:t>
+        <w:t xml:space="preserve">1차 테스트 — 핵심 업무 모듈(인사관리, 출퇴근, 휴가, 급여, 결재/승인, 설정)을 자세히 검증하고, 나머지 모듈(채용, 성과/보상, 인사이트 등)은 기본 동작만 간단히 점검합니다.</w:t>
       </w:r>
     </w:p>
     <w:p>
@@ -877,7 +687,7 @@
                 <w:sz w:val="22"/>
                 <w:szCs w:val="22"/>
               </w:rPr>
-              <w:t xml:space="preserve">상우님</w:t>
+              <w:t xml:space="preserve">강상우</w:t>
             </w:r>
           </w:p>
         </w:tc>
@@ -907,7 +717,7 @@
                 <w:sz w:val="22"/>
                 <w:szCs w:val="22"/>
               </w:rPr>
-              <w:t xml:space="preserve">전체 조율, 이슈 트리아지, 최종 판정</w:t>
+              <w:t xml:space="preserve">전체 조율, 이슈 분류, 최종 판정</w:t>
             </w:r>
           </w:p>
         </w:tc>
@@ -1148,7 +958,7 @@
                 <w:sz w:val="22"/>
                 <w:szCs w:val="22"/>
               </w:rPr>
-              <w:t xml:space="preserve">Day 1</w:t>
+              <w:t xml:space="preserve">1일차</w:t>
             </w:r>
           </w:p>
         </w:tc>
@@ -1178,7 +988,7 @@
                 <w:sz w:val="22"/>
                 <w:szCs w:val="22"/>
               </w:rPr>
-              <w:t xml:space="preserve">킥오프, 계정 확인, 가이드 워크스루, 스모크 테스트</w:t>
+              <w:t xml:space="preserve">시작 미팅, 계정 확인, 가이드 안내, 전체 기본 동작 점검</w:t>
             </w:r>
           </w:p>
         </w:tc>
@@ -1210,7 +1020,7 @@
                 <w:sz w:val="22"/>
                 <w:szCs w:val="22"/>
               </w:rPr>
-              <w:t xml:space="preserve">Day 2-4</w:t>
+              <w:t xml:space="preserve">2-4일차</w:t>
             </w:r>
           </w:p>
         </w:tc>
@@ -1272,7 +1082,7 @@
                 <w:sz w:val="22"/>
                 <w:szCs w:val="22"/>
               </w:rPr>
-              <w:t xml:space="preserve">Day 5-6</w:t>
+              <w:t xml:space="preserve">5-6일차</w:t>
             </w:r>
           </w:p>
         </w:tc>
@@ -1334,7 +1144,7 @@
                 <w:sz w:val="22"/>
                 <w:szCs w:val="22"/>
               </w:rPr>
-              <w:t xml:space="preserve">Day 7-8</w:t>
+              <w:t xml:space="preserve">7-8일차</w:t>
             </w:r>
           </w:p>
         </w:tc>
@@ -1396,7 +1206,7 @@
                 <w:sz w:val="22"/>
                 <w:szCs w:val="22"/>
               </w:rPr>
-              <w:t xml:space="preserve">Day 9</w:t>
+              <w:t xml:space="preserve">9일차</w:t>
             </w:r>
           </w:p>
         </w:tc>
@@ -1426,7 +1236,7 @@
                 <w:sz w:val="22"/>
                 <w:szCs w:val="22"/>
               </w:rPr>
-              <w:t xml:space="preserve">체크리스트 모듈 + 엣지케이스 + 수정건 재테스트</w:t>
+              <w:t xml:space="preserve">체크리스트 모듈 + 특수 상황 사례 + 수정 사항 재테스트</w:t>
             </w:r>
           </w:p>
         </w:tc>
@@ -1458,7 +1268,7 @@
                 <w:sz w:val="22"/>
                 <w:szCs w:val="22"/>
               </w:rPr>
-              <w:t xml:space="preserve">Day 10</w:t>
+              <w:t xml:space="preserve">10일차</w:t>
             </w:r>
           </w:p>
         </w:tc>
@@ -1488,7 +1298,7 @@
                 <w:sz w:val="22"/>
                 <w:szCs w:val="22"/>
               </w:rPr>
-              <w:t xml:space="preserve">최종 재테스트 + 알려진 이슈 정리 + 사인오프 결정</w:t>
+              <w:t xml:space="preserve">최종 재테스트 + 알려진 이슈 정리 + 최종 승인 결정</w:t>
             </w:r>
           </w:p>
         </w:tc>
@@ -1640,7 +1450,7 @@
                 <w:sz w:val="22"/>
                 <w:szCs w:val="22"/>
               </w:rPr>
-              <w:t xml:space="preserve">Staging URL</w:t>
+              <w:t xml:space="preserve">테스트 사이트 주소</w:t>
             </w:r>
           </w:p>
         </w:tc>
@@ -1702,7 +1512,7 @@
                 <w:sz w:val="22"/>
                 <w:szCs w:val="22"/>
               </w:rPr>
-              <w:t xml:space="preserve">로그인 방식</w:t>
+              <w:t xml:space="preserve">로그인 방법</w:t>
             </w:r>
           </w:p>
         </w:tc>
@@ -1732,7 +1542,7 @@
                 <w:sz w:val="22"/>
                 <w:szCs w:val="22"/>
               </w:rPr>
-              <w:t xml:space="preserve">테스트 계정 카드 (이메일만으로 로그인) — SSO 인증 불필요</w:t>
+              <w:t xml:space="preserve">테스트 계정 카드 클릭 — 비밀번호 불필요</w:t>
             </w:r>
           </w:p>
         </w:tc>
@@ -1877,7 +1687,7 @@
           <w:sz w:val="22"/>
           <w:szCs w:val="22"/>
         </w:rPr>
-        <w:t xml:space="preserve">왜 Staging인가? </w:t>
+        <w:t xml:space="preserve">왜 별도 테스트 사이트인가요? </w:t>
       </w:r>
       <w:r>
         <w:rPr>
@@ -1885,7 +1695,7 @@
           <w:sz w:val="22"/>
           <w:szCs w:val="22"/>
         </w:rPr>
-        <w:t xml:space="preserve">UAT는 5개 역할(EMPLOYEE/MANAGER/EXECUTIVE/HR_ADMIN/SUPER_ADMIN)을 모두 검증해야 합니다. Production은 회사 SSO 1:1 매핑이라 한 사람당 한 역할만 보이므로 multi-role 테스트가 불가능합니다. Staging은 dev login 카드로 9개 테스트 계정을 자유롭게 전환할 수 있어 UAT에 적합합니다.</w:t>
+        <w:t xml:space="preserve">UAT는 5개 역할(직원/팀장/임원/인사담당자/전사관리자)을 모두 점검해야 합니다. 실제 운영 사이트는 본인 계정으로만 로그인할 수 있어 한 사람당 한 역할만 보이지만, 테스트 사이트에서는 9개 테스트 계정 카드를 클릭만 하면 즉시 역할을 전환할 수 있어 UAT에 적합합니다.</w:t>
       </w:r>
     </w:p>
     <w:p>
@@ -1918,7 +1728,7 @@
           <w:sz w:val="22"/>
           <w:szCs w:val="22"/>
         </w:rPr>
-        <w:t xml:space="preserve">Staging 환경은 UAT 전용 시드 데이터로 구성됩니다 (엣지케이스 30명, 이력 3년치 사전 적재).</w:t>
+        <w:t xml:space="preserve">테스트 사이트는 UAT 전용 가상 데이터로 구성됩니다 (특수 상황 직원 30명, 3년치 이력 사전 입력).</w:t>
       </w:r>
     </w:p>
     <w:p>
@@ -1935,7 +1745,7 @@
           <w:sz w:val="22"/>
           <w:szCs w:val="22"/>
         </w:rPr>
-        <w:t xml:space="preserve">테스트 시작 전 seed 데이터로 초기화됩니다.</w:t>
+        <w:t xml:space="preserve">테스트 시작 전 가상 데이터로 초기화됩니다.</w:t>
       </w:r>
     </w:p>
     <w:p>
@@ -1952,7 +1762,7 @@
           <w:sz w:val="22"/>
           <w:szCs w:val="22"/>
         </w:rPr>
-        <w:t xml:space="preserve">테스트 기간 중 데이터 리셋이 필요한 경우 UAT 관리자에게 요청해 주세요.</w:t>
+        <w:t xml:space="preserve">테스트 기간 중 데이터 초기화가 필요하면 UAT 관리자에게 요청해 주세요.</w:t>
       </w:r>
     </w:p>
     <w:p>
@@ -1969,7 +1779,7 @@
           <w:sz w:val="22"/>
           <w:szCs w:val="22"/>
         </w:rPr>
-        <w:t xml:space="preserve">리셋 시 모든 테스트 데이터가 초기 상태로 돌아갑니다.</w:t>
+        <w:t xml:space="preserve">초기화 시 모든 테스트 데이터가 시작 상태로 돌아갑니다.</w:t>
       </w:r>
     </w:p>
     <w:p>
@@ -2002,7 +1812,7 @@
           <w:sz w:val="22"/>
           <w:szCs w:val="22"/>
         </w:rPr>
-        <w:t xml:space="preserve">Staging URL에 Chrome 브라우저로 접속합니다.</w:t>
+        <w:t xml:space="preserve">테스트 사이트 주소에 Chrome 브라우저로 접속합니다.</w:t>
       </w:r>
     </w:p>
     <w:p>
@@ -2019,7 +1829,7 @@
           <w:sz w:val="22"/>
           <w:szCs w:val="22"/>
         </w:rPr>
-        <w:t xml:space="preserve">로그인 화면에서 테스트 계정 카드 목록을 확인합니다 (9개 역할).</w:t>
+        <w:t xml:space="preserve">로그인 화면에서 테스트 계정 카드 목록을 확인합니다 (총 9개).</w:t>
       </w:r>
     </w:p>
     <w:p>
@@ -2036,7 +1846,7 @@
           <w:sz w:val="22"/>
           <w:szCs w:val="22"/>
         </w:rPr>
-        <w:t xml:space="preserve">테스트할 역할에 맞는 카드를 클릭하면 자동 로그인됩니다.</w:t>
+        <w:t xml:space="preserve">테스트할 역할에 맞는 카드를 클릭하면 자동으로 로그인됩니다.</w:t>
       </w:r>
     </w:p>
     <w:p>
@@ -2053,7 +1863,7 @@
           <w:sz w:val="22"/>
           <w:szCs w:val="22"/>
         </w:rPr>
-        <w:t xml:space="preserve">로그인 후 좌측 사이드바에서 각 메뉴로 이동하여 테스트를 진행합니다.</w:t>
+        <w:t xml:space="preserve">로그인 후 왼쪽 메뉴에서 각 항목으로 이동하여 테스트를 진행합니다.</w:t>
       </w:r>
     </w:p>
     <w:p>
@@ -2070,7 +1880,7 @@
           <w:sz w:val="22"/>
           <w:szCs w:val="22"/>
         </w:rPr>
-        <w:t xml:space="preserve">다른 역할로 전환하려면 우측 상단 프로필 → 로그아웃 후 다른 카드를 선택합니다.</w:t>
+        <w:t xml:space="preserve">다른 역할로 바꾸려면 오른쪽 위 프로필 → 로그아웃 후 다른 카드를 클릭합니다.</w:t>
       </w:r>
     </w:p>
     <w:p>
@@ -2088,7 +1898,7 @@
           <w:sz w:val="22"/>
           <w:szCs w:val="22"/>
         </w:rPr>
-        <w:t xml:space="preserve">⚠ Production과의 차이: </w:t>
+        <w:t xml:space="preserve">⚠ 실제 운영 사이트와의 차이: </w:t>
       </w:r>
       <w:r>
         <w:rPr>
@@ -2096,7 +1906,7 @@
           <w:sz w:val="22"/>
           <w:szCs w:val="22"/>
         </w:rPr>
-        <w:t xml:space="preserve">Production(hr.ctr.co.kr)은 Microsoft 365 SSO 전용으로 운영되며, dev login 카드가 표시되지 않습니다. UAT는 Staging URL로 진행해야 9개 테스트 계정 사용이 가능합니다.</w:t>
+        <w:t xml:space="preserve">실제 운영 사이트(hr.ctr.co.kr)에서는 Microsoft 365 회사 계정으로만 로그인할 수 있고, 테스트 카드가 표시되지 않습니다. UAT 기간 동안은 반드시 이 가이드의 테스트 사이트 주소로 접속해 주세요.</w:t>
       </w:r>
     </w:p>
     <w:p>
@@ -2141,7 +1951,7 @@
           <w:sz w:val="22"/>
           <w:szCs w:val="22"/>
         </w:rPr>
-        <w:t xml:space="preserve">Staging 환경에서 dev login 카드로 즉시 전환 가능한 시드 계정입니다. 이메일만 입력하면 로그인되며, 비밀번호나 SSO 인증은 불필요합니다.</w:t>
+        <w:t xml:space="preserve">테스트 사이트의 로그인 화면에서 아래 카드를 클릭하면 즉시 해당 역할로 로그인됩니다. 비밀번호나 회사 계정 인증은 필요하지 않습니다.</w:t>
       </w:r>
     </w:p>
     <w:tbl>
@@ -2518,7 +2328,7 @@
                 <w:sz w:val="22"/>
                 <w:szCs w:val="22"/>
               </w:rPr>
-              <w:t xml:space="preserve">SUPER_ADMIN</w:t>
+              <w:t xml:space="preserve">전사관리자</w:t>
             </w:r>
           </w:p>
         </w:tc>
@@ -2730,7 +2540,7 @@
                 <w:sz w:val="22"/>
                 <w:szCs w:val="22"/>
               </w:rPr>
-              <w:t xml:space="preserve">HR_ADMIN</w:t>
+              <w:t xml:space="preserve">인사담당자</w:t>
             </w:r>
           </w:p>
         </w:tc>
@@ -2942,7 +2752,7 @@
                 <w:sz w:val="22"/>
                 <w:szCs w:val="22"/>
               </w:rPr>
-              <w:t xml:space="preserve">HR_ADMIN</w:t>
+              <w:t xml:space="preserve">인사담당자</w:t>
             </w:r>
           </w:p>
         </w:tc>
@@ -3154,7 +2964,7 @@
                 <w:sz w:val="22"/>
                 <w:szCs w:val="22"/>
               </w:rPr>
-              <w:t xml:space="preserve">MANAGER</w:t>
+              <w:t xml:space="preserve">팀장</w:t>
             </w:r>
           </w:p>
         </w:tc>
@@ -3366,7 +3176,7 @@
                 <w:sz w:val="22"/>
                 <w:szCs w:val="22"/>
               </w:rPr>
-              <w:t xml:space="preserve">MANAGER</w:t>
+              <w:t xml:space="preserve">팀장</w:t>
             </w:r>
           </w:p>
         </w:tc>
@@ -3578,7 +3388,7 @@
                 <w:sz w:val="22"/>
                 <w:szCs w:val="22"/>
               </w:rPr>
-              <w:t xml:space="preserve">EMPLOYEE</w:t>
+              <w:t xml:space="preserve">직원</w:t>
             </w:r>
           </w:p>
         </w:tc>
@@ -3790,7 +3600,7 @@
                 <w:sz w:val="22"/>
                 <w:szCs w:val="22"/>
               </w:rPr>
-              <w:t xml:space="preserve">EMPLOYEE</w:t>
+              <w:t xml:space="preserve">직원</w:t>
             </w:r>
           </w:p>
         </w:tc>
@@ -4002,7 +3812,7 @@
                 <w:sz w:val="22"/>
                 <w:szCs w:val="22"/>
               </w:rPr>
-              <w:t xml:space="preserve">EMPLOYEE</w:t>
+              <w:t xml:space="preserve">직원</w:t>
             </w:r>
           </w:p>
         </w:tc>
@@ -4214,7 +4024,7 @@
                 <w:sz w:val="22"/>
                 <w:szCs w:val="22"/>
               </w:rPr>
-              <w:t xml:space="preserve">EXECUTIVE</w:t>
+              <w:t xml:space="preserve">임원</w:t>
             </w:r>
           </w:p>
         </w:tc>
@@ -4412,7 +4222,7 @@
                 <w:sz w:val="22"/>
                 <w:szCs w:val="22"/>
               </w:rPr>
-              <w:t xml:space="preserve">EMPLOYEE</w:t>
+              <w:t xml:space="preserve">직원</w:t>
             </w:r>
           </w:p>
         </w:tc>
@@ -4445,7 +4255,7 @@
                 <w:sz w:val="22"/>
                 <w:szCs w:val="22"/>
               </w:rPr>
-              <w:t xml:space="preserve">MANAGER</w:t>
+              <w:t xml:space="preserve">팀장</w:t>
             </w:r>
           </w:p>
         </w:tc>
@@ -4478,7 +4288,7 @@
                 <w:sz w:val="22"/>
                 <w:szCs w:val="22"/>
               </w:rPr>
-              <w:t xml:space="preserve">EXECUTIVE</w:t>
+              <w:t xml:space="preserve">임원</w:t>
             </w:r>
           </w:p>
         </w:tc>
@@ -4511,7 +4321,7 @@
                 <w:sz w:val="22"/>
                 <w:szCs w:val="22"/>
               </w:rPr>
-              <w:t xml:space="preserve">HR_ADMIN</w:t>
+              <w:t xml:space="preserve">인사담당자</w:t>
             </w:r>
           </w:p>
         </w:tc>
@@ -4544,7 +4354,7 @@
                 <w:sz w:val="22"/>
                 <w:szCs w:val="22"/>
               </w:rPr>
-              <w:t xml:space="preserve">SUPER_ADMIN</w:t>
+              <w:t xml:space="preserve">전사관리자</w:t>
             </w:r>
           </w:p>
         </w:tc>
@@ -6318,7 +6128,7 @@
                 <w:sz w:val="22"/>
                 <w:szCs w:val="22"/>
               </w:rPr>
-              <w:t xml:space="preserve">직원 셀프서비스</w:t>
+              <w:t xml:space="preserve">직원 셀프서비스 (휴가/근태/내 정보)</w:t>
             </w:r>
           </w:p>
         </w:tc>
@@ -6380,7 +6190,7 @@
                 <w:sz w:val="22"/>
                 <w:szCs w:val="22"/>
               </w:rPr>
-              <w:t xml:space="preserve">매니저 기능</w:t>
+              <w:t xml:space="preserve">팀장 기능 (팀 관리/결재)</w:t>
             </w:r>
           </w:p>
         </w:tc>
@@ -6442,7 +6252,7 @@
                 <w:sz w:val="22"/>
                 <w:szCs w:val="22"/>
               </w:rPr>
-              <w:t xml:space="preserve">HR 관리 전체</w:t>
+              <w:t xml:space="preserve">인사 관리 전체</w:t>
             </w:r>
           </w:p>
         </w:tc>
@@ -6504,7 +6314,7 @@
                 <w:sz w:val="22"/>
                 <w:szCs w:val="22"/>
               </w:rPr>
-              <w:t xml:space="preserve">다국적 테스트</w:t>
+              <w:t xml:space="preserve">해외 법인 테스트 (중국)</w:t>
             </w:r>
           </w:p>
         </w:tc>
@@ -6566,7 +6376,7 @@
                 <w:sz w:val="22"/>
                 <w:szCs w:val="22"/>
               </w:rPr>
-              <w:t xml:space="preserve">임원 분석</w:t>
+              <w:t xml:space="preserve">임원 분석 대시보드</w:t>
             </w:r>
           </w:p>
         </w:tc>
@@ -6628,7 +6438,7 @@
                 <w:sz w:val="22"/>
                 <w:szCs w:val="22"/>
               </w:rPr>
-              <w:t xml:space="preserve">최고 관리자</w:t>
+              <w:t xml:space="preserve">전사 관리 (전 법인 권한)</w:t>
             </w:r>
           </w:p>
         </w:tc>
@@ -6682,7 +6492,7 @@
           <w:sz w:val="32"/>
           <w:szCs w:val="32"/>
         </w:rPr>
-        <w:t xml:space="preserve">5. V2 대시보드 화면 안내 (NEW)</w:t>
+        <w:t xml:space="preserve">5. 주요 화면 안내</w:t>
       </w:r>
     </w:p>
     <w:p>
@@ -6695,7 +6505,7 @@
           <w:sz w:val="22"/>
           <w:szCs w:val="22"/>
         </w:rPr>
-        <w:t xml:space="preserve">v1.0 → v2.0의 핵심 변경사항입니다. 홈 대시보드가 V2로 정식 승격(R4 promote 완료)되어 4개 역할별로 별도 레이아웃이 제공됩니다. 아래는 각 역할이 로그인 직후 보게 될 메인 화면입니다.</w:t>
+        <w:t xml:space="preserve">아래는 각 역할로 로그인했을 때 가장 먼저 보게 될 주요 화면입니다. 화면 구성을 미리 익혀두시면 테스트가 수월합니다.</w:t>
       </w:r>
     </w:p>
     <w:p>
@@ -6721,7 +6531,7 @@
           <w:sz w:val="22"/>
           <w:szCs w:val="22"/>
         </w:rPr>
-        <w:t xml:space="preserve">commit a5b0dade(2026-05-10) 시점, 1440×900 viewport, ko-KR locale, Light mode. Staging과 Production은 동일 코드 베이스이므로 화면 레이아웃은 일치합니다.</w:t>
+        <w:t xml:space="preserve">2026-05-10 기준, 한국어 화면, 일반 데스크톱 해상도. 화면 구성은 실제 운영 사이트와 동일합니다.</w:t>
       </w:r>
     </w:p>
     <w:p>
@@ -6750,7 +6560,7 @@
           <w:sz w:val="22"/>
           <w:szCs w:val="22"/>
         </w:rPr>
-        <w:t xml:space="preserve">로그인 직후 사용자가 가장 먼저 보는 화면입니다. 역할에 따라 노출되는 카드와 KPI가 달라집니다.</w:t>
+        <w:t xml:space="preserve">로그인 직후 가장 먼저 보이는 화면입니다. 역할에 따라 노출되는 카드와 지표가 달라집니다.</w:t>
       </w:r>
     </w:p>
     <w:p>
@@ -6766,7 +6576,7 @@
           <w:sz w:val="22"/>
           <w:szCs w:val="22"/>
         </w:rPr>
-        <w:t xml:space="preserve">5.1.1 EMPLOYEE — 이민준 (employee-a@ctr.co.kr)</w:t>
+        <w:t xml:space="preserve">5.1.1 직원 — 이민준 (employee-a@ctr.co.kr)</w:t>
       </w:r>
     </w:p>
     <w:p>
@@ -6779,7 +6589,7 @@
           <w:sz w:val="22"/>
           <w:szCs w:val="22"/>
         </w:rPr>
-        <w:t xml:space="preserve">직원이 보는 홈입니다. 본인 출근 상태, 휴가 잔액, 본인 작업(My Tasks), 알림이 핵심 카드로 노출됩니다.</w:t>
+        <w:t xml:space="preserve">일반 직원이 보는 홈 화면입니다. 본인 출근 상태, 휴가 잔여 일수, 본인 할 일, 알림이 주요 카드로 표시됩니다.</w:t>
       </w:r>
     </w:p>
     <w:p>
@@ -6792,7 +6602,7 @@
           <wp:inline distT="0" distB="0" distL="0" distR="0">
             <wp:extent cx="5943600" cy="3714750"/>
             <wp:effectExtent t="0" r="0" b="0" l="0"/>
-            <wp:docPr id="1" name="home-employee.png" descr="그림 5-1. EMPLOYEE 역할 홈 대시보드" title="그림 5-1. EMPLOYEE 역할 홈 대시보드"/>
+            <wp:docPr id="1" name="home-employee.png" descr="그림 5-1. 직원 역할 홈 화면" title="그림 5-1. 직원 역할 홈 화면"/>
             <wp:cNvGraphicFramePr>
               <a:graphicFrameLocks xmlns:a="http://schemas.openxmlformats.org/drawingml/2006/main" noChangeAspect="1"/>
             </wp:cNvGraphicFramePr>
@@ -6842,7 +6652,7 @@
           <w:sz w:val="20"/>
           <w:szCs w:val="20"/>
         </w:rPr>
-        <w:t xml:space="preserve">그림 5-1. EMPLOYEE 역할 홈 대시보드</w:t>
+        <w:t xml:space="preserve">그림 5-1. 직원 역할 홈 화면</w:t>
       </w:r>
     </w:p>
     <w:p>
@@ -6858,7 +6668,7 @@
           <w:sz w:val="22"/>
           <w:szCs w:val="22"/>
         </w:rPr>
-        <w:t xml:space="preserve">5.1.2 MANAGER — 박준혁 (manager@ctr.co.kr)</w:t>
+        <w:t xml:space="preserve">5.1.2 팀장 — 박준혁 (manager@ctr.co.kr)</w:t>
       </w:r>
     </w:p>
     <w:p>
@@ -6871,7 +6681,7 @@
           <w:sz w:val="22"/>
           <w:szCs w:val="22"/>
         </w:rPr>
-        <w:t xml:space="preserve">팀장이 보는 홈입니다. 팀 출근 현황, 결재 대기, 1:1 미팅 일정, 분기 평가 진행률이 카드로 표시됩니다.</w:t>
+        <w:t xml:space="preserve">팀장이 보는 홈 화면입니다. 팀 출근 현황, 결재 대기, 1:1 미팅 일정, 분기 평가 진행률이 표시됩니다.</w:t>
       </w:r>
     </w:p>
     <w:p>
@@ -6884,7 +6694,7 @@
           <wp:inline distT="0" distB="0" distL="0" distR="0">
             <wp:extent cx="5943600" cy="3714750"/>
             <wp:effectExtent t="0" r="0" b="0" l="0"/>
-            <wp:docPr id="1" name="home-manager.png" descr="그림 5-2. MANAGER 역할 홈 대시보드" title="그림 5-2. MANAGER 역할 홈 대시보드"/>
+            <wp:docPr id="1" name="home-manager.png" descr="그림 5-2. 팀장 역할 홈 화면" title="그림 5-2. 팀장 역할 홈 화면"/>
             <wp:cNvGraphicFramePr>
               <a:graphicFrameLocks xmlns:a="http://schemas.openxmlformats.org/drawingml/2006/main" noChangeAspect="1"/>
             </wp:cNvGraphicFramePr>
@@ -6934,7 +6744,7 @@
           <w:sz w:val="20"/>
           <w:szCs w:val="20"/>
         </w:rPr>
-        <w:t xml:space="preserve">그림 5-2. MANAGER 역할 홈 대시보드</w:t>
+        <w:t xml:space="preserve">그림 5-2. 팀장 역할 홈 화면</w:t>
       </w:r>
     </w:p>
     <w:p>
@@ -6950,7 +6760,7 @@
           <w:sz w:val="22"/>
           <w:szCs w:val="22"/>
         </w:rPr>
-        <w:t xml:space="preserve">5.1.3 HR_ADMIN — 한지영 (hr@ctr.co.kr)</w:t>
+        <w:t xml:space="preserve">5.1.3 인사담당자 — 한지영 (hr@ctr.co.kr)</w:t>
       </w:r>
     </w:p>
     <w:p>
@@ -6963,7 +6773,7 @@
           <w:sz w:val="22"/>
           <w:szCs w:val="22"/>
         </w:rPr>
-        <w:t xml:space="preserve">HR 담당자가 보는 홈입니다. 전사 출근 현황, 결재 대기, 온보딩/오프보딩 트래커, 휴가 통계가 노출됩니다.</w:t>
+        <w:t xml:space="preserve">인사 담당자가 보는 홈 화면입니다. 전사 출근 현황, 결재 대기, 입사/퇴사 진행 현황, 휴가 통계가 표시됩니다.</w:t>
       </w:r>
     </w:p>
     <w:p>
@@ -6976,7 +6786,7 @@
           <wp:inline distT="0" distB="0" distL="0" distR="0">
             <wp:extent cx="5943600" cy="3714750"/>
             <wp:effectExtent t="0" r="0" b="0" l="0"/>
-            <wp:docPr id="1" name="home-hr-admin.png" descr="그림 5-3. HR_ADMIN 역할 홈 대시보드" title="그림 5-3. HR_ADMIN 역할 홈 대시보드"/>
+            <wp:docPr id="1" name="home-hr-admin.png" descr="그림 5-3. 인사담당자 역할 홈 화면" title="그림 5-3. 인사담당자 역할 홈 화면"/>
             <wp:cNvGraphicFramePr>
               <a:graphicFrameLocks xmlns:a="http://schemas.openxmlformats.org/drawingml/2006/main" noChangeAspect="1"/>
             </wp:cNvGraphicFramePr>
@@ -7026,7 +6836,7 @@
           <w:sz w:val="20"/>
           <w:szCs w:val="20"/>
         </w:rPr>
-        <w:t xml:space="preserve">그림 5-3. HR_ADMIN 역할 홈 대시보드</w:t>
+        <w:t xml:space="preserve">그림 5-3. 인사담당자 역할 홈 화면</w:t>
       </w:r>
     </w:p>
     <w:p>
@@ -7042,7 +6852,7 @@
           <w:sz w:val="22"/>
           <w:szCs w:val="22"/>
         </w:rPr>
-        <w:t xml:space="preserve">5.1.4 SUPER_ADMIN — 대조영 (super@ctr.co.kr)</w:t>
+        <w:t xml:space="preserve">5.1.4 전사관리자 — 대조영 (super@ctr.co.kr)</w:t>
       </w:r>
     </w:p>
     <w:p>
@@ -7055,7 +6865,7 @@
           <w:sz w:val="22"/>
           <w:szCs w:val="22"/>
         </w:rPr>
-        <w:t xml:space="preserve">지주사 최고 관리자가 보는 홈입니다. 전 법인 통합 KPI, 회사 스위처(cross-company), 시스템 알림이 표시됩니다.</w:t>
+        <w:t xml:space="preserve">지주사 차원의 최고 관리자가 보는 홈 화면입니다. 전 법인 통합 지표, 회사 전환 메뉴, 시스템 공지가 표시됩니다.</w:t>
       </w:r>
     </w:p>
     <w:p>
@@ -7068,7 +6878,7 @@
           <wp:inline distT="0" distB="0" distL="0" distR="0">
             <wp:extent cx="5943600" cy="3714750"/>
             <wp:effectExtent t="0" r="0" b="0" l="0"/>
-            <wp:docPr id="1" name="home-super-admin.png" descr="그림 5-4. SUPER_ADMIN 역할 홈 대시보드" title="그림 5-4. SUPER_ADMIN 역할 홈 대시보드"/>
+            <wp:docPr id="1" name="home-super-admin.png" descr="그림 5-4. 전사관리자 역할 홈 화면" title="그림 5-4. 전사관리자 역할 홈 화면"/>
             <wp:cNvGraphicFramePr>
               <a:graphicFrameLocks xmlns:a="http://schemas.openxmlformats.org/drawingml/2006/main" noChangeAspect="1"/>
             </wp:cNvGraphicFramePr>
@@ -7118,7 +6928,7 @@
           <w:sz w:val="20"/>
           <w:szCs w:val="20"/>
         </w:rPr>
-        <w:t xml:space="preserve">그림 5-4. SUPER_ADMIN 역할 홈 대시보드</w:t>
+        <w:t xml:space="preserve">그림 5-4. 전사관리자 역할 홈 화면</w:t>
       </w:r>
     </w:p>
     <w:p>
@@ -7139,7 +6949,7 @@
           <w:sz w:val="26"/>
           <w:szCs w:val="26"/>
         </w:rPr>
-        <w:t xml:space="preserve">5.2 결재함 (Approvals Inbox)</w:t>
+        <w:t xml:space="preserve">5.2 결재함</w:t>
       </w:r>
     </w:p>
     <w:p>
@@ -7152,7 +6962,7 @@
           <w:sz w:val="22"/>
           <w:szCs w:val="22"/>
         </w:rPr>
-        <w:t xml:space="preserve">역할별 결재 대기 목록입니다. EMPLOYEE는 본인 신청 건만 보이고, MANAGER/HR_ADMIN은 결재 대기 + 본인 신청 둘 다 보입니다.</w:t>
+        <w:t xml:space="preserve">역할별 결재 대기 목록입니다. 직원은 본인이 올린 신청 건만 보이고, 팀장/인사담당자는 결재 대기 건과 본인이 올린 건이 함께 보입니다.</w:t>
       </w:r>
     </w:p>
     <w:p>
@@ -7168,7 +6978,7 @@
           <w:sz w:val="22"/>
           <w:szCs w:val="22"/>
         </w:rPr>
-        <w:t xml:space="preserve">5.2.1 EMPLOYEE 결재함</w:t>
+        <w:t xml:space="preserve">5.2.1 직원 결재함</w:t>
       </w:r>
     </w:p>
     <w:p>
@@ -7181,7 +6991,7 @@
           <wp:inline distT="0" distB="0" distL="0" distR="0">
             <wp:extent cx="5943600" cy="3714750"/>
             <wp:effectExtent t="0" r="0" b="0" l="0"/>
-            <wp:docPr id="1" name="approvals-inbox-employee.png" descr="그림 5-5. EMPLOYEE 역할 결재함" title="그림 5-5. EMPLOYEE 역할 결재함"/>
+            <wp:docPr id="1" name="approvals-inbox-employee.png" descr="그림 5-5. 직원 역할 결재함" title="그림 5-5. 직원 역할 결재함"/>
             <wp:cNvGraphicFramePr>
               <a:graphicFrameLocks xmlns:a="http://schemas.openxmlformats.org/drawingml/2006/main" noChangeAspect="1"/>
             </wp:cNvGraphicFramePr>
@@ -7231,7 +7041,7 @@
           <w:sz w:val="20"/>
           <w:szCs w:val="20"/>
         </w:rPr>
-        <w:t xml:space="preserve">그림 5-5. EMPLOYEE 역할 결재함</w:t>
+        <w:t xml:space="preserve">그림 5-5. 직원 역할 결재함</w:t>
       </w:r>
     </w:p>
     <w:p>
@@ -7247,7 +7057,7 @@
           <w:sz w:val="22"/>
           <w:szCs w:val="22"/>
         </w:rPr>
-        <w:t xml:space="preserve">5.2.2 MANAGER 결재함</w:t>
+        <w:t xml:space="preserve">5.2.2 팀장 결재함</w:t>
       </w:r>
     </w:p>
     <w:p>
@@ -7260,7 +7070,7 @@
           <wp:inline distT="0" distB="0" distL="0" distR="0">
             <wp:extent cx="5943600" cy="3714750"/>
             <wp:effectExtent t="0" r="0" b="0" l="0"/>
-            <wp:docPr id="1" name="approvals-inbox-manager.png" descr="그림 5-6. MANAGER 역할 결재함" title="그림 5-6. MANAGER 역할 결재함"/>
+            <wp:docPr id="1" name="approvals-inbox-manager.png" descr="그림 5-6. 팀장 역할 결재함" title="그림 5-6. 팀장 역할 결재함"/>
             <wp:cNvGraphicFramePr>
               <a:graphicFrameLocks xmlns:a="http://schemas.openxmlformats.org/drawingml/2006/main" noChangeAspect="1"/>
             </wp:cNvGraphicFramePr>
@@ -7310,7 +7120,7 @@
           <w:sz w:val="20"/>
           <w:szCs w:val="20"/>
         </w:rPr>
-        <w:t xml:space="preserve">그림 5-6. MANAGER 역할 결재함</w:t>
+        <w:t xml:space="preserve">그림 5-6. 팀장 역할 결재함</w:t>
       </w:r>
     </w:p>
     <w:p>
@@ -7326,7 +7136,7 @@
           <w:sz w:val="22"/>
           <w:szCs w:val="22"/>
         </w:rPr>
-        <w:t xml:space="preserve">5.2.3 HR_ADMIN 결재함</w:t>
+        <w:t xml:space="preserve">5.2.3 인사담당자 결재함</w:t>
       </w:r>
     </w:p>
     <w:p>
@@ -7339,7 +7149,7 @@
           <wp:inline distT="0" distB="0" distL="0" distR="0">
             <wp:extent cx="5943600" cy="3714750"/>
             <wp:effectExtent t="0" r="0" b="0" l="0"/>
-            <wp:docPr id="1" name="approvals-inbox-hr-admin.png" descr="그림 5-7. HR_ADMIN 역할 결재함" title="그림 5-7. HR_ADMIN 역할 결재함"/>
+            <wp:docPr id="1" name="approvals-inbox-hr-admin.png" descr="그림 5-7. 인사담당자 역할 결재함" title="그림 5-7. 인사담당자 역할 결재함"/>
             <wp:cNvGraphicFramePr>
               <a:graphicFrameLocks xmlns:a="http://schemas.openxmlformats.org/drawingml/2006/main" noChangeAspect="1"/>
             </wp:cNvGraphicFramePr>
@@ -7389,7 +7199,7 @@
           <w:sz w:val="20"/>
           <w:szCs w:val="20"/>
         </w:rPr>
-        <w:t xml:space="preserve">그림 5-7. HR_ADMIN 역할 결재함</w:t>
+        <w:t xml:space="preserve">그림 5-7. 인사담당자 역할 결재함</w:t>
       </w:r>
     </w:p>
     <w:p>
@@ -7405,7 +7215,7 @@
           <w:sz w:val="22"/>
           <w:szCs w:val="22"/>
         </w:rPr>
-        <w:t xml:space="preserve">5.2.4 SUPER_ADMIN 결재함</w:t>
+        <w:t xml:space="preserve">5.2.4 전사관리자 결재함</w:t>
       </w:r>
     </w:p>
     <w:p>
@@ -7418,7 +7228,7 @@
           <wp:inline distT="0" distB="0" distL="0" distR="0">
             <wp:extent cx="5943600" cy="3714750"/>
             <wp:effectExtent t="0" r="0" b="0" l="0"/>
-            <wp:docPr id="1" name="approvals-inbox-super-admin.png" descr="그림 5-8. SUPER_ADMIN 역할 결재함" title="그림 5-8. SUPER_ADMIN 역할 결재함"/>
+            <wp:docPr id="1" name="approvals-inbox-super-admin.png" descr="그림 5-8. 전사관리자 역할 결재함" title="그림 5-8. 전사관리자 역할 결재함"/>
             <wp:cNvGraphicFramePr>
               <a:graphicFrameLocks xmlns:a="http://schemas.openxmlformats.org/drawingml/2006/main" noChangeAspect="1"/>
             </wp:cNvGraphicFramePr>
@@ -7468,7 +7278,7 @@
           <w:sz w:val="20"/>
           <w:szCs w:val="20"/>
         </w:rPr>
-        <w:t xml:space="preserve">그림 5-8. SUPER_ADMIN 역할 결재함</w:t>
+        <w:t xml:space="preserve">그림 5-8. 전사관리자 역할 결재함</w:t>
       </w:r>
     </w:p>
     <w:p>
@@ -7502,7 +7312,7 @@
           <w:sz w:val="22"/>
           <w:szCs w:val="22"/>
         </w:rPr>
-        <w:t xml:space="preserve">역할별 시스템 알림 목록입니다. 결재 알림, 일정 알림, 시스템 공지가 통합되어 표시됩니다.</w:t>
+        <w:t xml:space="preserve">역할별 알림 목록입니다. 결재 알림, 일정 알림, 시스템 공지가 한 곳에서 통합 표시됩니다.</w:t>
       </w:r>
     </w:p>
     <w:p>
@@ -7518,7 +7328,7 @@
           <w:sz w:val="22"/>
           <w:szCs w:val="22"/>
         </w:rPr>
-        <w:t xml:space="preserve">5.3.1 EMPLOYEE 알림</w:t>
+        <w:t xml:space="preserve">5.3.1 직원 알림</w:t>
       </w:r>
     </w:p>
     <w:p>
@@ -7531,7 +7341,7 @@
           <wp:inline distT="0" distB="0" distL="0" distR="0">
             <wp:extent cx="5943600" cy="3714750"/>
             <wp:effectExtent t="0" r="0" b="0" l="0"/>
-            <wp:docPr id="1" name="notifications-employee.png" descr="그림 5-9. EMPLOYEE 역할 알림" title="그림 5-9. EMPLOYEE 역할 알림"/>
+            <wp:docPr id="1" name="notifications-employee.png" descr="그림 5-9. 직원 역할 알림" title="그림 5-9. 직원 역할 알림"/>
             <wp:cNvGraphicFramePr>
               <a:graphicFrameLocks xmlns:a="http://schemas.openxmlformats.org/drawingml/2006/main" noChangeAspect="1"/>
             </wp:cNvGraphicFramePr>
@@ -7581,7 +7391,7 @@
           <w:sz w:val="20"/>
           <w:szCs w:val="20"/>
         </w:rPr>
-        <w:t xml:space="preserve">그림 5-9. EMPLOYEE 역할 알림</w:t>
+        <w:t xml:space="preserve">그림 5-9. 직원 역할 알림</w:t>
       </w:r>
     </w:p>
     <w:p>
@@ -7597,7 +7407,7 @@
           <w:sz w:val="22"/>
           <w:szCs w:val="22"/>
         </w:rPr>
-        <w:t xml:space="preserve">5.3.2 MANAGER 알림</w:t>
+        <w:t xml:space="preserve">5.3.2 팀장 알림</w:t>
       </w:r>
     </w:p>
     <w:p>
@@ -7610,7 +7420,7 @@
           <wp:inline distT="0" distB="0" distL="0" distR="0">
             <wp:extent cx="5943600" cy="3714750"/>
             <wp:effectExtent t="0" r="0" b="0" l="0"/>
-            <wp:docPr id="1" name="notifications-manager.png" descr="그림 5-10. MANAGER 역할 알림" title="그림 5-10. MANAGER 역할 알림"/>
+            <wp:docPr id="1" name="notifications-manager.png" descr="그림 5-10. 팀장 역할 알림" title="그림 5-10. 팀장 역할 알림"/>
             <wp:cNvGraphicFramePr>
               <a:graphicFrameLocks xmlns:a="http://schemas.openxmlformats.org/drawingml/2006/main" noChangeAspect="1"/>
             </wp:cNvGraphicFramePr>
@@ -7660,7 +7470,7 @@
           <w:sz w:val="20"/>
           <w:szCs w:val="20"/>
         </w:rPr>
-        <w:t xml:space="preserve">그림 5-10. MANAGER 역할 알림</w:t>
+        <w:t xml:space="preserve">그림 5-10. 팀장 역할 알림</w:t>
       </w:r>
     </w:p>
     <w:p>
@@ -7676,7 +7486,7 @@
           <w:sz w:val="22"/>
           <w:szCs w:val="22"/>
         </w:rPr>
-        <w:t xml:space="preserve">5.3.3 HR_ADMIN 알림</w:t>
+        <w:t xml:space="preserve">5.3.3 인사담당자 알림</w:t>
       </w:r>
     </w:p>
     <w:p>
@@ -7689,7 +7499,7 @@
           <wp:inline distT="0" distB="0" distL="0" distR="0">
             <wp:extent cx="5943600" cy="3714750"/>
             <wp:effectExtent t="0" r="0" b="0" l="0"/>
-            <wp:docPr id="1" name="notifications-hr-admin.png" descr="그림 5-11. HR_ADMIN 역할 알림" title="그림 5-11. HR_ADMIN 역할 알림"/>
+            <wp:docPr id="1" name="notifications-hr-admin.png" descr="그림 5-11. 인사담당자 역할 알림" title="그림 5-11. 인사담당자 역할 알림"/>
             <wp:cNvGraphicFramePr>
               <a:graphicFrameLocks xmlns:a="http://schemas.openxmlformats.org/drawingml/2006/main" noChangeAspect="1"/>
             </wp:cNvGraphicFramePr>
@@ -7739,7 +7549,7 @@
           <w:sz w:val="20"/>
           <w:szCs w:val="20"/>
         </w:rPr>
-        <w:t xml:space="preserve">그림 5-11. HR_ADMIN 역할 알림</w:t>
+        <w:t xml:space="preserve">그림 5-11. 인사담당자 역할 알림</w:t>
       </w:r>
     </w:p>
     <w:p>
@@ -7755,7 +7565,7 @@
           <w:sz w:val="22"/>
           <w:szCs w:val="22"/>
         </w:rPr>
-        <w:t xml:space="preserve">5.3.4 SUPER_ADMIN 알림</w:t>
+        <w:t xml:space="preserve">5.3.4 전사관리자 알림</w:t>
       </w:r>
     </w:p>
     <w:p>
@@ -7768,7 +7578,7 @@
           <wp:inline distT="0" distB="0" distL="0" distR="0">
             <wp:extent cx="5943600" cy="3714750"/>
             <wp:effectExtent t="0" r="0" b="0" l="0"/>
-            <wp:docPr id="1" name="notifications-super-admin.png" descr="그림 5-12. SUPER_ADMIN 역할 알림" title="그림 5-12. SUPER_ADMIN 역할 알림"/>
+            <wp:docPr id="1" name="notifications-super-admin.png" descr="그림 5-12. 전사관리자 역할 알림" title="그림 5-12. 전사관리자 역할 알림"/>
             <wp:cNvGraphicFramePr>
               <a:graphicFrameLocks xmlns:a="http://schemas.openxmlformats.org/drawingml/2006/main" noChangeAspect="1"/>
             </wp:cNvGraphicFramePr>
@@ -7818,7 +7628,7 @@
           <w:sz w:val="20"/>
           <w:szCs w:val="20"/>
         </w:rPr>
-        <w:t xml:space="preserve">그림 5-12. SUPER_ADMIN 역할 알림</w:t>
+        <w:t xml:space="preserve">그림 5-12. 전사관리자 역할 알림</w:t>
       </w:r>
     </w:p>
     <w:p>
@@ -7834,7 +7644,7 @@
           <w:sz w:val="32"/>
           <w:szCs w:val="32"/>
         </w:rPr>
-        <w:t xml:space="preserve">6. 테스트 데이터 카탈로그</w:t>
+        <w:t xml:space="preserve">6. 테스트 데이터 안내</w:t>
       </w:r>
     </w:p>
     <w:p>
@@ -7850,7 +7660,7 @@
           <w:sz w:val="26"/>
           <w:szCs w:val="26"/>
         </w:rPr>
-        <w:t xml:space="preserve">6.1 엣지케이스 페르소나 (30명)</w:t>
+        <w:t xml:space="preserve">6.1 특수 상황 테스트 직원 (30명)</w:t>
       </w:r>
     </w:p>
     <w:p>
@@ -7863,7 +7673,7 @@
           <w:sz w:val="22"/>
           <w:szCs w:val="22"/>
         </w:rPr>
-        <w:t xml:space="preserve">시스템에는 비정상 상황을 시뮬레이션하기 위한 30명의 특수 직원이 등록되어 있습니다. 아래는 주요 엣지케이스 페르소나입니다.</w:t>
+        <w:t xml:space="preserve">실제 인사 업무에서 자주 발생하는 까다로운 상황을 점검할 수 있도록 30명의 특수 상황 가상 직원이 미리 등록되어 있습니다. 아래는 대표 사례입니다.</w:t>
       </w:r>
     </w:p>
     <w:p>
@@ -7879,7 +7689,7 @@
           <w:sz w:val="22"/>
           <w:szCs w:val="22"/>
         </w:rPr>
-        <w:t xml:space="preserve">고용 상태 엣지케이스 (8명)</w:t>
+        <w:t xml:space="preserve">고용 상태 관련 (8명)</w:t>
       </w:r>
     </w:p>
     <w:tbl>
@@ -9027,7 +8837,7 @@
           <w:sz w:val="22"/>
           <w:szCs w:val="22"/>
         </w:rPr>
-        <w:t xml:space="preserve">조직 엣지케이스 (일부)</w:t>
+        <w:t xml:space="preserve">조직 구성 관련 (일부)</w:t>
       </w:r>
     </w:p>
     <w:tbl>
@@ -9440,7 +9250,7 @@
           <w:sz w:val="22"/>
           <w:szCs w:val="22"/>
         </w:rPr>
-        <w:t xml:space="preserve">※ 나머지 엣지케이스는 테스트북 엣지케이스 시트를 참고해 주세요.</w:t>
+        <w:t xml:space="preserve">※ 나머지 특수 상황 직원은 별도 테스트북 파일의 특수 상황 시트를 참고해 주세요.</w:t>
       </w:r>
     </w:p>
     <w:p>
@@ -9910,7 +9720,7 @@
                 <w:sz w:val="22"/>
                 <w:szCs w:val="22"/>
               </w:rPr>
-              <w:t xml:space="preserve">Critical</w:t>
+              <w:t xml:space="preserve">치명적 (Critical)</w:t>
             </w:r>
           </w:p>
         </w:tc>
@@ -9970,7 +9780,7 @@
                 <w:sz w:val="22"/>
                 <w:szCs w:val="22"/>
               </w:rPr>
-              <w:t xml:space="preserve">로그인 불가, 급여 계산 오류, 타 법인 데이터 노출</w:t>
+              <w:t xml:space="preserve">로그인 불가, 급여 계산 오류, 다른 법인 데이터가 보임</w:t>
             </w:r>
           </w:p>
         </w:tc>
@@ -10002,7 +9812,7 @@
                 <w:sz w:val="22"/>
                 <w:szCs w:val="22"/>
               </w:rPr>
-              <w:t xml:space="preserve">Major</w:t>
+              <w:t xml:space="preserve">중대 (Major)</w:t>
             </w:r>
           </w:p>
         </w:tc>
@@ -10032,7 +9842,7 @@
                 <w:sz w:val="22"/>
                 <w:szCs w:val="22"/>
               </w:rPr>
-              <w:t xml:space="preserve">핵심 업무 수행 방해, 우회 방법 없음</w:t>
+              <w:t xml:space="preserve">핵심 업무 수행 불가, 우회 방법 없음</w:t>
             </w:r>
           </w:p>
         </w:tc>
@@ -10094,7 +9904,7 @@
                 <w:sz w:val="22"/>
                 <w:szCs w:val="22"/>
               </w:rPr>
-              <w:t xml:space="preserve">Minor</w:t>
+              <w:t xml:space="preserve">경미 (Minor)</w:t>
             </w:r>
           </w:p>
         </w:tc>
@@ -10124,7 +9934,7 @@
                 <w:sz w:val="22"/>
                 <w:szCs w:val="22"/>
               </w:rPr>
-              <w:t xml:space="preserve">불편하지만 우회 가능</w:t>
+              <w:t xml:space="preserve">불편하지만 다른 방법으로 진행 가능</w:t>
             </w:r>
           </w:p>
         </w:tc>
@@ -10154,7 +9964,7 @@
                 <w:sz w:val="22"/>
                 <w:szCs w:val="22"/>
               </w:rPr>
-              <w:t xml:space="preserve">UI 정렬 깨짐, 번역 누락, 느린 로딩</w:t>
+              <w:t xml:space="preserve">화면 정렬 어긋남, 번역 누락, 로딩이 느림</w:t>
             </w:r>
           </w:p>
         </w:tc>
@@ -10186,7 +9996,7 @@
                 <w:sz w:val="22"/>
                 <w:szCs w:val="22"/>
               </w:rPr>
-              <w:t xml:space="preserve">개선</w:t>
+              <w:t xml:space="preserve">개선 제안</w:t>
             </w:r>
           </w:p>
         </w:tc>
@@ -10216,7 +10026,7 @@
                 <w:sz w:val="22"/>
                 <w:szCs w:val="22"/>
               </w:rPr>
-              <w:t xml:space="preserve">기능 개선 제안</w:t>
+              <w:t xml:space="preserve">기능 개선 아이디어</w:t>
             </w:r>
           </w:p>
         </w:tc>
@@ -10246,7 +10056,7 @@
                 <w:sz w:val="22"/>
                 <w:szCs w:val="22"/>
               </w:rPr>
-              <w:t xml:space="preserve">UX 개선, 추가 필터 요청, 라벨 변경</w:t>
+              <w:t xml:space="preserve">사용성 개선, 필터 추가 요청, 라벨 변경</w:t>
             </w:r>
           </w:p>
         </w:tc>
@@ -10278,7 +10088,7 @@
           <w:sz w:val="22"/>
           <w:szCs w:val="22"/>
         </w:rPr>
-        <w:t xml:space="preserve">이슈 발견 시 피드백 Excel 파일에 아래 정보를 기입합니다. 정확한 재현 정보가 빠른 수정의 핵심입니다.</w:t>
+        <w:t xml:space="preserve">이슈가 발견되면 별도 피드백 Excel 파일에 아래 정보를 기록해 주세요. 재현 절차가 정확할수록 수정이 빨라집니다.</w:t>
       </w:r>
     </w:p>
     <w:tbl>
@@ -10859,7 +10669,7 @@
                 <w:sz w:val="22"/>
                 <w:szCs w:val="22"/>
               </w:rPr>
-              <w:t xml:space="preserve">현재 페이지 URL</w:t>
+              <w:t xml:space="preserve">현재 페이지 주소</w:t>
             </w:r>
           </w:p>
         </w:tc>
@@ -10981,7 +10791,7 @@
                 <w:sz w:val="22"/>
                 <w:szCs w:val="22"/>
               </w:rPr>
-              <w:t xml:space="preserve">재현 스텝</w:t>
+              <w:t xml:space="preserve">재현 절차</w:t>
             </w:r>
           </w:p>
         </w:tc>
@@ -11011,7 +10821,7 @@
                 <w:sz w:val="22"/>
                 <w:szCs w:val="22"/>
               </w:rPr>
-              <w:t xml:space="preserve">단계별 조작 과정</w:t>
+              <w:t xml:space="preserve">클릭/입력 등 단계별 조작 과정</w:t>
             </w:r>
           </w:p>
         </w:tc>
@@ -11133,7 +10943,7 @@
                 <w:sz w:val="22"/>
                 <w:szCs w:val="22"/>
               </w:rPr>
-              <w:t xml:space="preserve">무엇이 되어야 하는지</w:t>
+              <w:t xml:space="preserve">원래는 어떻게 되어야 하는지</w:t>
             </w:r>
           </w:p>
         </w:tc>
@@ -11163,7 +10973,7 @@
                 <w:sz w:val="22"/>
                 <w:szCs w:val="22"/>
               </w:rPr>
-              <w:t xml:space="preserve">휴가 신청 완료 메시지 표시</w:t>
+              <w:t xml:space="preserve">"휴가 신청 완료" 메시지가 표시되어야 함</w:t>
             </w:r>
           </w:p>
         </w:tc>
@@ -11255,7 +11065,7 @@
                 <w:sz w:val="22"/>
                 <w:szCs w:val="22"/>
               </w:rPr>
-              <w:t xml:space="preserve">실제로 무엇이 일어났는지</w:t>
+              <w:t xml:space="preserve">실제로 어떤 일이 일어났는지</w:t>
             </w:r>
           </w:p>
         </w:tc>
@@ -11285,7 +11095,7 @@
                 <w:sz w:val="22"/>
                 <w:szCs w:val="22"/>
               </w:rPr>
-              <w:t xml:space="preserve">에러 메시지: "서버 오류"</w:t>
+              <w:t xml:space="preserve">오류 메시지가 표시됨: "서버 오류"</w:t>
             </w:r>
           </w:p>
         </w:tc>
@@ -11377,7 +11187,7 @@
                 <w:sz w:val="22"/>
                 <w:szCs w:val="22"/>
               </w:rPr>
-              <w:t xml:space="preserve">위 기준 참고</w:t>
+              <w:t xml:space="preserve">위 7번 섹션의 기준 참고</w:t>
             </w:r>
           </w:p>
         </w:tc>
@@ -11407,7 +11217,7 @@
                 <w:sz w:val="22"/>
                 <w:szCs w:val="22"/>
               </w:rPr>
-              <w:t xml:space="preserve">Major</w:t>
+              <w:t xml:space="preserve">중대 (Major)</w:t>
             </w:r>
           </w:p>
         </w:tc>
@@ -11469,7 +11279,7 @@
                 <w:sz w:val="22"/>
                 <w:szCs w:val="22"/>
               </w:rPr>
-              <w:t xml:space="preserve">스크린샷</w:t>
+              <w:t xml:space="preserve">화면 캡처</w:t>
             </w:r>
           </w:p>
         </w:tc>
@@ -11499,7 +11309,7 @@
                 <w:sz w:val="22"/>
                 <w:szCs w:val="22"/>
               </w:rPr>
-              <w:t xml:space="preserve">가능하면 첨부 (Print Screen → Excel 붙여넣기)</w:t>
+              <w:t xml:space="preserve">가능하면 첨부 (PrintScreen → Excel에 붙여넣기)</w:t>
             </w:r>
           </w:p>
         </w:tc>
@@ -11561,28 +11371,7 @@
           <w:sz w:val="22"/>
           <w:szCs w:val="22"/>
         </w:rPr>
-        <w:t xml:space="preserve">아래 항목들은 현재 개발 중이거나 의도된 동작입니다. 버그가 아니니 참고만 해주세요.</w:t>
-      </w:r>
-    </w:p>
-    <w:p>
-      <w:pPr>
-        <w:spacing w:after="100"/>
-        <w:rPr>
-          <w:i/>
-          <w:iCs/>
-          <w:color w:val="595959"/>
-        </w:rPr>
-      </w:pPr>
-      <w:r>
-        <w:rPr>
-          <w:rFonts w:ascii="Malgun Gothic" w:cs="Malgun Gothic" w:eastAsia="Malgun Gothic" w:hAnsi="Malgun Gothic"/>
-          <w:i/>
-          <w:iCs/>
-          <w:color w:val="595959"/>
-          <w:sz w:val="22"/>
-          <w:szCs w:val="22"/>
-        </w:rPr>
-        <w:t xml:space="preserve">v1.0 → v2.0: 8건 → 5건으로 감소했습니다 (Phase 9 회귀 안전망 batch 1-17 반영, E2E 137 → 14 fail).</w:t>
+        <w:t xml:space="preserve">아래 항목들은 현재 개발팀이 인지하고 있거나 의도된 동작입니다. 버그가 아니니 발견하셔도 따로 보고하지 않으셔도 됩니다.</w:t>
       </w:r>
     </w:p>
     <w:tbl>
@@ -11763,7 +11552,7 @@
                 <w:sz w:val="22"/>
                 <w:szCs w:val="22"/>
               </w:rPr>
-              <w:t xml:space="preserve">비정기 보상 이벤트 알림 미발송</w:t>
+              <w:t xml:space="preserve">비정기 보상 변경 알림 미발송</w:t>
             </w:r>
           </w:p>
         </w:tc>
@@ -11793,7 +11582,7 @@
                 <w:sz w:val="22"/>
                 <w:szCs w:val="22"/>
               </w:rPr>
-              <w:t xml:space="preserve">이벤트 버스 미구현. Off-cycle compensation의 submit/approve/reject 시 알림이 자동 발송되지 않음. (Session 207에서 trailing self-skip 회귀는 fix됨)</w:t>
+              <w:t xml:space="preserve">정기 보상 외 임시 보상 조정 시 결재 알림이 자동 발송되지 않습니다 (개발팀에서 별도 작업 중).</w:t>
             </w:r>
           </w:p>
         </w:tc>
@@ -11855,7 +11644,7 @@
                 <w:sz w:val="22"/>
                 <w:szCs w:val="22"/>
               </w:rPr>
-              <w:t xml:space="preserve">출퇴근 관리 에러 토스트 미표시</w:t>
+              <w:t xml:space="preserve">출퇴근 화면 일부 오류 메시지 누락</w:t>
             </w:r>
           </w:p>
         </w:tc>
@@ -11885,7 +11674,7 @@
                 <w:sz w:val="22"/>
                 <w:szCs w:val="22"/>
               </w:rPr>
-              <w:t xml:space="preserve">일부 오류 상황에서 사용자 알림이 뜨지 않음 (콘솔에만 기록)</w:t>
+              <w:t xml:space="preserve">특정 오류 상황에서 화면 알림이 표시되지 않을 수 있습니다.</w:t>
             </w:r>
           </w:p>
         </w:tc>
@@ -11947,7 +11736,7 @@
                 <w:sz w:val="22"/>
                 <w:szCs w:val="22"/>
               </w:rPr>
-              <w:t xml:space="preserve">발령일 타임존 비교 이슈</w:t>
+              <w:t xml:space="preserve">발령일 날짜 계산 1일 오차 가능</w:t>
             </w:r>
           </w:p>
         </w:tc>
@@ -11977,7 +11766,7 @@
                 <w:sz w:val="22"/>
                 <w:szCs w:val="22"/>
               </w:rPr>
-              <w:t xml:space="preserve">UTC vs 로컬 타임존 비교에서 경계값 차이 발생 가능 (1일 오차)</w:t>
+              <w:t xml:space="preserve">시간대 처리 차이로 인해 발령일이 1일 다르게 보일 수 있습니다.</w:t>
             </w:r>
           </w:p>
         </w:tc>
@@ -12039,7 +11828,7 @@
                 <w:sz w:val="22"/>
                 <w:szCs w:val="22"/>
               </w:rPr>
-              <w:t xml:space="preserve">Redis 캐시 키 불일치</w:t>
+              <w:t xml:space="preserve">법인 코드 변경 시 캐시 새로고침 필요</w:t>
             </w:r>
           </w:p>
         </w:tc>
@@ -12069,7 +11858,7 @@
                 <w:sz w:val="22"/>
                 <w:szCs w:val="22"/>
               </w:rPr>
-              <w:t xml:space="preserve">법인 코드 변경 시 수동 캐시 초기화 필요 (운영 배포 시 조치 예정)</w:t>
+              <w:t xml:space="preserve">법인 코드를 변경한 직후 화면이 즉시 반영되지 않을 수 있으며, 잠시 후 새로고침 시 정상 표시됩니다.</w:t>
             </w:r>
           </w:p>
         </w:tc>
@@ -12131,7 +11920,7 @@
                 <w:sz w:val="22"/>
                 <w:szCs w:val="22"/>
               </w:rPr>
-              <w:t xml:space="preserve">E2E API 12건 잔여 fail</w:t>
+              <w:t xml:space="preserve">일부 자동 검증 항목 점검 중</w:t>
             </w:r>
           </w:p>
         </w:tc>
@@ -12161,7 +11950,7 @@
                 <w:sz w:val="22"/>
                 <w:szCs w:val="22"/>
               </w:rPr>
-              <w:t xml:space="preserve">Phase 9 Cluster D — heterogeneous (503 rate limit / boolean assertion drift / 409 sequence / 500). 별도 batch에서 정리 중. UAT 시나리오에는 영향 없음.</w:t>
+              <w:t xml:space="preserve">내부 자동 점검 항목 중 일부가 별도 정리 작업 중이며, UAT 시나리오 진행에는 영향이 없습니다.</w:t>
             </w:r>
           </w:p>
         </w:tc>
@@ -12180,7 +11969,7 @@
           <w:sz w:val="32"/>
           <w:szCs w:val="32"/>
         </w:rPr>
-        <w:t xml:space="preserve">10. 통과 기준 &amp; 사인오프</w:t>
+        <w:t xml:space="preserve">10. 통과 기준 &amp; 최종 승인</w:t>
       </w:r>
     </w:p>
     <w:p>
@@ -12313,7 +12102,7 @@
                 <w:sz w:val="22"/>
                 <w:szCs w:val="22"/>
               </w:rPr>
-              <w:t xml:space="preserve">Critical 이슈</w:t>
+              <w:t xml:space="preserve">치명적 이슈 (Critical)</w:t>
             </w:r>
           </w:p>
         </w:tc>
@@ -12375,7 +12164,7 @@
                 <w:sz w:val="22"/>
                 <w:szCs w:val="22"/>
               </w:rPr>
-              <w:t xml:space="preserve">Major (핵심 모듈)</w:t>
+              <w:t xml:space="preserve">중대 이슈 (Major) — 핵심 모듈</w:t>
             </w:r>
           </w:p>
         </w:tc>
@@ -12437,7 +12226,7 @@
                 <w:sz w:val="22"/>
                 <w:szCs w:val="22"/>
               </w:rPr>
-              <w:t xml:space="preserve">Major (전체)</w:t>
+              <w:t xml:space="preserve">중대 이슈 (Major) — 전체</w:t>
             </w:r>
           </w:p>
         </w:tc>
@@ -12561,7 +12350,7 @@
                 <w:sz w:val="22"/>
                 <w:szCs w:val="22"/>
               </w:rPr>
-              <w:t xml:space="preserve">체크리스트 스모크 통과율</w:t>
+              <w:t xml:space="preserve">전체 체크리스트 통과율</w:t>
             </w:r>
           </w:p>
         </w:tc>
@@ -12653,7 +12442,7 @@
                 <w:sz w:val="22"/>
                 <w:szCs w:val="22"/>
               </w:rPr>
-              <w:t xml:space="preserve">0건 — 법인 격리, 급여 유출, 권한 누수</w:t>
+              <w:t xml:space="preserve">0건 — 법인 간 데이터 분리, 급여 정보 유출, 권한 누수</w:t>
             </w:r>
           </w:p>
         </w:tc>
@@ -12669,7 +12458,7 @@
           <w:sz w:val="22"/>
           <w:szCs w:val="22"/>
         </w:rPr>
-        <w:t xml:space="preserve">※ "해결됨" 정의: 수정 완료 → staging 배포 → 보고자 재테스트 → 종료</w:t>
+        <w:t xml:space="preserve">※ "해결됨" 정의: 수정 완료 → 테스트 사이트 반영 → 보고자가 재테스트 → 종료</w:t>
       </w:r>
     </w:p>
     <w:p>
@@ -12685,7 +12474,7 @@
           <w:sz w:val="26"/>
           <w:szCs w:val="26"/>
         </w:rPr>
-        <w:t xml:space="preserve">10.2 사인오프 양식</w:t>
+        <w:t xml:space="preserve">10.2 최종 승인 양식</w:t>
       </w:r>
     </w:p>
     <w:tbl>
@@ -13028,7 +12817,7 @@
                 <w:sz w:val="22"/>
                 <w:szCs w:val="22"/>
               </w:rPr>
-              <w:t xml:space="preserve">GO / NO-GO</w:t>
+              <w:t xml:space="preserve">승인 / 반려</w:t>
             </w:r>
           </w:p>
         </w:tc>
@@ -13210,7 +12999,7 @@
                 <w:sz w:val="22"/>
                 <w:szCs w:val="22"/>
               </w:rPr>
-              <w:t xml:space="preserve">GO / NO-GO</w:t>
+              <w:t xml:space="preserve">승인 / 반려</w:t>
             </w:r>
           </w:p>
         </w:tc>
@@ -13392,7 +13181,7 @@
                 <w:sz w:val="22"/>
                 <w:szCs w:val="22"/>
               </w:rPr>
-              <w:t xml:space="preserve">GO / NO-GO</w:t>
+              <w:t xml:space="preserve">승인 / 반려</w:t>
             </w:r>
           </w:p>
         </w:tc>
@@ -13574,7 +13363,7 @@
                 <w:sz w:val="22"/>
                 <w:szCs w:val="22"/>
               </w:rPr>
-              <w:t xml:space="preserve">GO / NO-GO</w:t>
+              <w:t xml:space="preserve">승인 / 반려</w:t>
             </w:r>
           </w:p>
         </w:tc>
@@ -13756,7 +13545,7 @@
                 <w:sz w:val="22"/>
                 <w:szCs w:val="22"/>
               </w:rPr>
-              <w:t xml:space="preserve">GO / NO-GO</w:t>
+              <w:t xml:space="preserve">승인 / 반려</w:t>
             </w:r>
           </w:p>
         </w:tc>
@@ -13938,7 +13727,7 @@
                 <w:sz w:val="22"/>
                 <w:szCs w:val="22"/>
               </w:rPr>
-              <w:t xml:space="preserve">GO / NO-GO</w:t>
+              <w:t xml:space="preserve">승인 / 반려</w:t>
             </w:r>
           </w:p>
         </w:tc>
@@ -14120,7 +13909,7 @@
                 <w:sz w:val="22"/>
                 <w:szCs w:val="22"/>
               </w:rPr>
-              <w:t xml:space="preserve">GO / NO-GO</w:t>
+              <w:t xml:space="preserve">승인 / 반려</w:t>
             </w:r>
           </w:p>
         </w:tc>
@@ -14212,7 +14001,7 @@
           <w:sz w:val="22"/>
           <w:szCs w:val="22"/>
         </w:rPr>
-        <w:t xml:space="preserve">☐  전체 GO — 운영 배포 진행</w:t>
+        <w:t xml:space="preserve">☐  전체 승인 — 운영 배포 진행</w:t>
       </w:r>
     </w:p>
     <w:p>
@@ -14225,7 +14014,7 @@
           <w:sz w:val="22"/>
           <w:szCs w:val="22"/>
         </w:rPr>
-        <w:t xml:space="preserve">☐  조건부 GO — 명시된 조건 해결 후 배포</w:t>
+        <w:t xml:space="preserve">☐  조건부 승인 — 명시된 조건 해결 후 배포</w:t>
       </w:r>
     </w:p>
     <w:p>
@@ -14238,7 +14027,7 @@
           <w:sz w:val="22"/>
           <w:szCs w:val="22"/>
         </w:rPr>
-        <w:t xml:space="preserve">☐  NO-GO — 재테스트 필요</w:t>
+        <w:t xml:space="preserve">☐  반려 — 재테스트 필요</w:t>
       </w:r>
     </w:p>
     <w:p>
@@ -14442,7 +14231,7 @@
         <w:sz w:val="18"/>
         <w:szCs w:val="18"/>
       </w:rPr>
-      <w:t xml:space="preserve">CTR HR Hub UAT 가이드 v2.0</w:t>
+      <w:t xml:space="preserve">CTR HR Hub UAT 가이드</w:t>
     </w:r>
   </w:p>
 </w:hdr>

</xml_diff>